<commit_message>
Renumber stratified table to 5 so table numbers follow document order; rewrap Figure 3 band
</commit_message>
<xml_diff>
--- a/黑色素瘤ICB签名可复现性_预登记研究_Cancers投稿稿.docx
+++ b/黑色素瘤ICB签名可复现性_预登记研究_Cancers投稿稿.docx
@@ -451,7 +451,7 @@
                     <pic:cNvPicPr/>
                   </pic:nvPicPr>
                   <pic:blipFill>
-                    <a:blip xmlns:r="http://schemas.openxmlformats.org/officeDocument/2006/relationships" r:embed="R477ff2e2bf9a49e2"/>
+                    <a:blip xmlns:r="http://schemas.openxmlformats.org/officeDocument/2006/relationships" r:embed="Rfc02a9a46ad741a9"/>
                     <a:stretch>
                       <a:fillRect/>
                     </a:stretch>
@@ -1334,7 +1334,7 @@
                     <pic:cNvPicPr/>
                   </pic:nvPicPr>
                   <pic:blipFill>
-                    <a:blip xmlns:r="http://schemas.openxmlformats.org/officeDocument/2006/relationships" r:embed="R67f9f7776ebf480d"/>
+                    <a:blip xmlns:r="http://schemas.openxmlformats.org/officeDocument/2006/relationships" r:embed="R853a289c25894a72"/>
                     <a:stretch>
                       <a:fillRect/>
                     </a:stretch>
@@ -1705,7 +1705,7 @@
                     <pic:cNvPicPr/>
                   </pic:nvPicPr>
                   <pic:blipFill>
-                    <a:blip xmlns:r="http://schemas.openxmlformats.org/officeDocument/2006/relationships" r:embed="Raa72e8793ba54c65"/>
+                    <a:blip xmlns:r="http://schemas.openxmlformats.org/officeDocument/2006/relationships" r:embed="Rba0c81ca52964fd7"/>
                     <a:stretch>
                       <a:fillRect/>
                     </a:stretch>
@@ -2720,7 +2720,7 @@
         <w:pStyle w:val="Normal"/>
       </w:pPr>
       <w:r>
-        <w:t xml:space="preserve">Treatment regimen did not explain the result either. Within GSE215868, IMPRES gave 0.490 (0.304–0.682) in the ipilimumab–nivolumab stratum, 0.485 (0.235–0.730) in the nivolumab stratum and 0.547 (0.297–0.801) in the pembrolizumab stratum. We report the corresponding IPS-MHC+CP estimates in full for transparency: 0.524 (0.326–0.726), 0.710 (0.450–0.920) with 10 responders and 10 non-responders, and 0.570 (0.320–0.805) respectively. The nivolumab value for IPS-MHC+CP is the highest number in this study for that signature, and it is the reason the full stratified results are given in Table 6 rather than only the favourable strata: a table reporting only the good ones would be selection rather than audit. With 20 patients and an interval spanning 0.45 to 0.92 it carries no inferential weight, and we draw no conclusion from it.</w:t>
+        <w:t xml:space="preserve">Treatment regimen did not explain the result either. Within GSE215868, IMPRES gave 0.490 (0.304–0.682) in the ipilimumab–nivolumab stratum, 0.485 (0.235–0.730) in the nivolumab stratum and 0.547 (0.297–0.801) in the pembrolizumab stratum. We report the corresponding IPS-MHC+CP estimates in full for transparency: 0.524 (0.326–0.726), 0.710 (0.450–0.920) with 10 responders and 10 non-responders, and 0.570 (0.320–0.805) respectively. The nivolumab value for IPS-MHC+CP is the highest number in this study for that signature, and it is the reason the full stratified results are given in Table 5 rather than only the favourable strata: a table reporting only the good ones would be selection rather than audit. With 20 patients and an interval spanning 0.45 to 0.92 it carries no inferential weight, and we draw no conclusion from it.</w:t>
       </w:r>
     </w:p>
     <w:p>
@@ -2741,7 +2741,7 @@
         <w:rPr>
           <w:b/>
         </w:rPr>
-        <w:t>Table 6. Stratified results underlying Section 3.7, reported in full including strata that do not favour the conclusion. n is responders / non-responders.</w:t>
+        <w:t>Table 5. Stratified results underlying Section 3.7, reported in full including strata that do not favour the conclusion. n is responders / non-responders.</w:t>
       </w:r>
     </w:p>
     <w:tbl>
@@ -3536,7 +3536,7 @@
                     <pic:cNvPicPr/>
                   </pic:nvPicPr>
                   <pic:blipFill>
-                    <a:blip xmlns:r="http://schemas.openxmlformats.org/officeDocument/2006/relationships" r:embed="R2e3347c38c6c49cb"/>
+                    <a:blip xmlns:r="http://schemas.openxmlformats.org/officeDocument/2006/relationships" r:embed="Rbfdb62e0932b4170"/>
                     <a:stretch>
                       <a:fillRect/>
                     </a:stretch>
@@ -3576,7 +3576,7 @@
         <w:rPr>
           <w:b/>
         </w:rPr>
-        <w:t>Table 5. Attribution boundary. Alternative explanations for the negative result, whether the present data can exclude them, and the artefact that does so.</w:t>
+        <w:t>Table 6. Attribution boundary. Alternative explanations for the negative result, whether the present data can exclude them, and the artefact that does so.</w:t>
       </w:r>
     </w:p>
     <w:tbl>

</xml_diff>

<commit_message>
Format tables as booktabs three-line tables (2pt top/bottom, 1pt header rule, no vertical or row rules, no shading); table text 8pt with wider cell margins
</commit_message>
<xml_diff>
--- a/黑色素瘤ICB签名可复现性_预登记研究_Cancers投稿稿.docx
+++ b/黑色素瘤ICB签名可复现性_预登记研究_Cancers投稿稿.docx
@@ -451,7 +451,7 @@
                     <pic:cNvPicPr/>
                   </pic:nvPicPr>
                   <pic:blipFill>
-                    <a:blip xmlns:r="http://schemas.openxmlformats.org/officeDocument/2006/relationships" r:embed="Rfc02a9a46ad741a9"/>
+                    <a:blip xmlns:r="http://schemas.openxmlformats.org/officeDocument/2006/relationships" r:embed="Rb18ea55d862248c1"/>
                     <a:stretch>
                       <a:fillRect/>
                     </a:stretch>
@@ -498,11 +498,11 @@
       <w:tblPr>
         <w:tblW w:w="5000" w:type="pct"/>
         <w:tblBorders>
-          <w:top w:val="single" w:sz="8" w:space="0"/>
-          <w:bottom w:val="single" w:sz="8" w:space="0"/>
+          <w:top w:val="single" w:sz="16" w:space="0"/>
+          <w:bottom w:val="single" w:sz="16" w:space="0"/>
           <w:left w:val="none"/>
           <w:right w:val="none"/>
-          <w:insideH w:val="single" w:sz="4" w:space="0"/>
+          <w:insideH w:val="none"/>
           <w:insideV w:val="none"/>
         </w:tblBorders>
         <w:tblCellMar>
@@ -526,13 +526,15 @@
         <w:tc>
           <w:tcPr>
             <w:tcW w:w="2256" w:type="dxa"/>
-            <w:shd w:val="clear" w:color="auto" w:fill="F2F2F2"/>
-          </w:tcPr>
-          <w:p>
-            <w:pPr>
-              <w:pStyle w:val="TableText"/>
-              <w:jc w:val="left"/>
-              <w:spacing w:before="20" w:after="20" w:line="240" w:lineRule="auto"/>
+            <w:tcBorders>
+              <w:bottom w:val="single" w:sz="8" w:space="0"/>
+            </w:tcBorders>
+          </w:tcPr>
+          <w:p>
+            <w:pPr>
+              <w:pStyle w:val="TableText"/>
+              <w:jc w:val="left"/>
+              <w:spacing w:before="40" w:after="40" w:line="240" w:lineRule="auto"/>
             </w:pPr>
             <w:r>
               <w:rPr>
@@ -545,13 +547,15 @@
         <w:tc>
           <w:tcPr>
             <w:tcW w:w="2256" w:type="dxa"/>
-            <w:shd w:val="clear" w:color="auto" w:fill="F2F2F2"/>
-          </w:tcPr>
-          <w:p>
-            <w:pPr>
-              <w:pStyle w:val="TableText"/>
-              <w:jc w:val="left"/>
-              <w:spacing w:before="20" w:after="20" w:line="240" w:lineRule="auto"/>
+            <w:tcBorders>
+              <w:bottom w:val="single" w:sz="8" w:space="0"/>
+            </w:tcBorders>
+          </w:tcPr>
+          <w:p>
+            <w:pPr>
+              <w:pStyle w:val="TableText"/>
+              <w:jc w:val="left"/>
+              <w:spacing w:before="40" w:after="40" w:line="240" w:lineRule="auto"/>
             </w:pPr>
             <w:r>
               <w:rPr>
@@ -564,13 +568,15 @@
         <w:tc>
           <w:tcPr>
             <w:tcW w:w="2256" w:type="dxa"/>
-            <w:shd w:val="clear" w:color="auto" w:fill="F2F2F2"/>
-          </w:tcPr>
-          <w:p>
-            <w:pPr>
-              <w:pStyle w:val="TableText"/>
-              <w:jc w:val="left"/>
-              <w:spacing w:before="20" w:after="20" w:line="240" w:lineRule="auto"/>
+            <w:tcBorders>
+              <w:bottom w:val="single" w:sz="8" w:space="0"/>
+            </w:tcBorders>
+          </w:tcPr>
+          <w:p>
+            <w:pPr>
+              <w:pStyle w:val="TableText"/>
+              <w:jc w:val="left"/>
+              <w:spacing w:before="40" w:after="40" w:line="240" w:lineRule="auto"/>
             </w:pPr>
             <w:r>
               <w:rPr>
@@ -583,13 +589,15 @@
         <w:tc>
           <w:tcPr>
             <w:tcW w:w="2258" w:type="dxa"/>
-            <w:shd w:val="clear" w:color="auto" w:fill="F2F2F2"/>
-          </w:tcPr>
-          <w:p>
-            <w:pPr>
-              <w:pStyle w:val="TableText"/>
-              <w:jc w:val="left"/>
-              <w:spacing w:before="20" w:after="20" w:line="240" w:lineRule="auto"/>
+            <w:tcBorders>
+              <w:bottom w:val="single" w:sz="8" w:space="0"/>
+            </w:tcBorders>
+          </w:tcPr>
+          <w:p>
+            <w:pPr>
+              <w:pStyle w:val="TableText"/>
+              <w:jc w:val="left"/>
+              <w:spacing w:before="40" w:after="40" w:line="240" w:lineRule="auto"/>
             </w:pPr>
             <w:r>
               <w:rPr>
@@ -612,7 +620,7 @@
             <w:pPr>
               <w:pStyle w:val="TableText"/>
               <w:jc w:val="left"/>
-              <w:spacing w:before="20" w:after="20" w:line="240" w:lineRule="auto"/>
+              <w:spacing w:before="40" w:after="40" w:line="240" w:lineRule="auto"/>
             </w:pPr>
             <w:r>
               <w:t xml:space="preserve">Platform</w:t>
@@ -627,7 +635,7 @@
             <w:pPr>
               <w:pStyle w:val="TableText"/>
               <w:jc w:val="left"/>
-              <w:spacing w:before="20" w:after="20" w:line="240" w:lineRule="auto"/>
+              <w:spacing w:before="40" w:after="40" w:line="240" w:lineRule="auto"/>
             </w:pPr>
             <w:r>
               <w:t xml:space="preserve">RNA-seq</w:t>
@@ -642,7 +650,7 @@
             <w:pPr>
               <w:pStyle w:val="TableText"/>
               <w:jc w:val="left"/>
-              <w:spacing w:before="20" w:after="20" w:line="240" w:lineRule="auto"/>
+              <w:spacing w:before="40" w:after="40" w:line="240" w:lineRule="auto"/>
             </w:pPr>
             <w:r>
               <w:t xml:space="preserve">bulk RNA-seq</w:t>
@@ -657,7 +665,7 @@
             <w:pPr>
               <w:pStyle w:val="TableText"/>
               <w:jc w:val="left"/>
-              <w:spacing w:before="20" w:after="20" w:line="240" w:lineRule="auto"/>
+              <w:spacing w:before="40" w:after="40" w:line="240" w:lineRule="auto"/>
             </w:pPr>
             <w:r>
               <w:t xml:space="preserve">NanoString IO 360 (770 genes)</w:t>
@@ -677,7 +685,7 @@
             <w:pPr>
               <w:pStyle w:val="TableText"/>
               <w:jc w:val="left"/>
-              <w:spacing w:before="20" w:after="20" w:line="240" w:lineRule="auto"/>
+              <w:spacing w:before="40" w:after="40" w:line="240" w:lineRule="auto"/>
             </w:pPr>
             <w:r>
               <w:t xml:space="preserve">Samples (GEO)</w:t>
@@ -692,7 +700,7 @@
             <w:pPr>
               <w:pStyle w:val="TableText"/>
               <w:jc w:val="left"/>
-              <w:spacing w:before="20" w:after="20" w:line="240" w:lineRule="auto"/>
+              <w:spacing w:before="40" w:after="40" w:line="240" w:lineRule="auto"/>
             </w:pPr>
             <w:r>
               <w:t xml:space="preserve">109</w:t>
@@ -707,7 +715,7 @@
             <w:pPr>
               <w:pStyle w:val="TableText"/>
               <w:jc w:val="left"/>
-              <w:spacing w:before="20" w:after="20" w:line="240" w:lineRule="auto"/>
+              <w:spacing w:before="40" w:after="40" w:line="240" w:lineRule="auto"/>
             </w:pPr>
             <w:r>
               <w:t xml:space="preserve">28</w:t>
@@ -722,7 +730,7 @@
             <w:pPr>
               <w:pStyle w:val="TableText"/>
               <w:jc w:val="left"/>
-              <w:spacing w:before="20" w:after="20" w:line="240" w:lineRule="auto"/>
+              <w:spacing w:before="40" w:after="40" w:line="240" w:lineRule="auto"/>
             </w:pPr>
             <w:r>
               <w:t xml:space="preserve">105</w:t>
@@ -742,7 +750,7 @@
             <w:pPr>
               <w:pStyle w:val="TableText"/>
               <w:jc w:val="left"/>
-              <w:spacing w:before="20" w:after="20" w:line="240" w:lineRule="auto"/>
+              <w:spacing w:before="40" w:after="40" w:line="240" w:lineRule="auto"/>
             </w:pPr>
             <w:r>
               <w:t xml:space="preserve">Patients</w:t>
@@ -757,7 +765,7 @@
             <w:pPr>
               <w:pStyle w:val="TableText"/>
               <w:jc w:val="left"/>
-              <w:spacing w:before="20" w:after="20" w:line="240" w:lineRule="auto"/>
+              <w:spacing w:before="40" w:after="40" w:line="240" w:lineRule="auto"/>
             </w:pPr>
             <w:r>
               <w:t xml:space="preserve">65</w:t>
@@ -772,7 +780,7 @@
             <w:pPr>
               <w:pStyle w:val="TableText"/>
               <w:jc w:val="left"/>
-              <w:spacing w:before="20" w:after="20" w:line="240" w:lineRule="auto"/>
+              <w:spacing w:before="40" w:after="40" w:line="240" w:lineRule="auto"/>
             </w:pPr>
             <w:r>
               <w:t xml:space="preserve">26</w:t>
@@ -787,7 +795,7 @@
             <w:pPr>
               <w:pStyle w:val="TableText"/>
               <w:jc w:val="left"/>
-              <w:spacing w:before="20" w:after="20" w:line="240" w:lineRule="auto"/>
+              <w:spacing w:before="40" w:after="40" w:line="240" w:lineRule="auto"/>
             </w:pPr>
             <w:r>
               <w:t xml:space="preserve">105</w:t>
@@ -807,7 +815,7 @@
             <w:pPr>
               <w:pStyle w:val="TableText"/>
               <w:jc w:val="left"/>
-              <w:spacing w:before="20" w:after="20" w:line="240" w:lineRule="auto"/>
+              <w:spacing w:before="40" w:after="40" w:line="240" w:lineRule="auto"/>
             </w:pPr>
             <w:r>
               <w:t xml:space="preserve">Evaluable patients</w:t>
@@ -822,7 +830,7 @@
             <w:pPr>
               <w:pStyle w:val="TableText"/>
               <w:jc w:val="left"/>
-              <w:spacing w:before="20" w:after="20" w:line="240" w:lineRule="auto"/>
+              <w:spacing w:before="40" w:after="40" w:line="240" w:lineRule="auto"/>
             </w:pPr>
             <w:r>
               <w:t xml:space="preserve">33</w:t>
@@ -837,7 +845,7 @@
             <w:pPr>
               <w:pStyle w:val="TableText"/>
               <w:jc w:val="left"/>
-              <w:spacing w:before="20" w:after="20" w:line="240" w:lineRule="auto"/>
+              <w:spacing w:before="40" w:after="40" w:line="240" w:lineRule="auto"/>
             </w:pPr>
             <w:r>
               <w:t xml:space="preserve">26</w:t>
@@ -852,7 +860,7 @@
             <w:pPr>
               <w:pStyle w:val="TableText"/>
               <w:jc w:val="left"/>
-              <w:spacing w:before="20" w:after="20" w:line="240" w:lineRule="auto"/>
+              <w:spacing w:before="40" w:after="40" w:line="240" w:lineRule="auto"/>
             </w:pPr>
             <w:r>
               <w:t xml:space="preserve">79</w:t>
@@ -872,7 +880,7 @@
             <w:pPr>
               <w:pStyle w:val="TableText"/>
               <w:jc w:val="left"/>
-              <w:spacing w:before="20" w:after="20" w:line="240" w:lineRule="auto"/>
+              <w:spacing w:before="40" w:after="40" w:line="240" w:lineRule="auto"/>
             </w:pPr>
             <w:r>
               <w:t xml:space="preserve">Responders / non-responders</w:t>
@@ -887,7 +895,7 @@
             <w:pPr>
               <w:pStyle w:val="TableText"/>
               <w:jc w:val="left"/>
-              <w:spacing w:before="20" w:after="20" w:line="240" w:lineRule="auto"/>
+              <w:spacing w:before="40" w:after="40" w:line="240" w:lineRule="auto"/>
             </w:pPr>
             <w:r>
               <w:t xml:space="preserve">10 / 23</w:t>
@@ -902,7 +910,7 @@
             <w:pPr>
               <w:pStyle w:val="TableText"/>
               <w:jc w:val="left"/>
-              <w:spacing w:before="20" w:after="20" w:line="240" w:lineRule="auto"/>
+              <w:spacing w:before="40" w:after="40" w:line="240" w:lineRule="auto"/>
             </w:pPr>
             <w:r>
               <w:t xml:space="preserve">14 / 12</w:t>
@@ -917,7 +925,7 @@
             <w:pPr>
               <w:pStyle w:val="TableText"/>
               <w:jc w:val="left"/>
-              <w:spacing w:before="20" w:after="20" w:line="240" w:lineRule="auto"/>
+              <w:spacing w:before="40" w:after="40" w:line="240" w:lineRule="auto"/>
             </w:pPr>
             <w:r>
               <w:t xml:space="preserve">45 / 34</w:t>
@@ -937,7 +945,7 @@
             <w:pPr>
               <w:pStyle w:val="TableText"/>
               <w:jc w:val="left"/>
-              <w:spacing w:before="20" w:after="20" w:line="240" w:lineRule="auto"/>
+              <w:spacing w:before="40" w:after="40" w:line="240" w:lineRule="auto"/>
             </w:pPr>
             <w:r>
               <w:t xml:space="preserve">Biopsy timepoint used</w:t>
@@ -952,7 +960,7 @@
             <w:pPr>
               <w:pStyle w:val="TableText"/>
               <w:jc w:val="left"/>
-              <w:spacing w:before="20" w:after="20" w:line="240" w:lineRule="auto"/>
+              <w:spacing w:before="40" w:after="40" w:line="240" w:lineRule="auto"/>
             </w:pPr>
             <w:r>
               <w:t xml:space="preserve">pre-treatment</w:t>
@@ -967,7 +975,7 @@
             <w:pPr>
               <w:pStyle w:val="TableText"/>
               <w:jc w:val="left"/>
-              <w:spacing w:before="20" w:after="20" w:line="240" w:lineRule="auto"/>
+              <w:spacing w:before="40" w:after="40" w:line="240" w:lineRule="auto"/>
             </w:pPr>
             <w:r>
               <w:t xml:space="preserve">pre-treatment (26 of 27)</w:t>
@@ -982,7 +990,7 @@
             <w:pPr>
               <w:pStyle w:val="TableText"/>
               <w:jc w:val="left"/>
-              <w:spacing w:before="20" w:after="20" w:line="240" w:lineRule="auto"/>
+              <w:spacing w:before="40" w:after="40" w:line="240" w:lineRule="auto"/>
             </w:pPr>
             <w:r>
               <w:t xml:space="preserve">pre-treatment (all)</w:t>
@@ -1002,7 +1010,7 @@
             <w:pPr>
               <w:pStyle w:val="TableText"/>
               <w:jc w:val="left"/>
-              <w:spacing w:before="20" w:after="20" w:line="240" w:lineRule="auto"/>
+              <w:spacing w:before="40" w:after="40" w:line="240" w:lineRule="auto"/>
             </w:pPr>
             <w:r>
               <w:t xml:space="preserve">Regimen</w:t>
@@ -1017,7 +1025,7 @@
             <w:pPr>
               <w:pStyle w:val="TableText"/>
               <w:jc w:val="left"/>
-              <w:spacing w:before="20" w:after="20" w:line="240" w:lineRule="auto"/>
+              <w:spacing w:before="40" w:after="40" w:line="240" w:lineRule="auto"/>
             </w:pPr>
             <w:r>
               <w:t xml:space="preserve">nivolumab</w:t>
@@ -1032,7 +1040,7 @@
             <w:pPr>
               <w:pStyle w:val="TableText"/>
               <w:jc w:val="left"/>
-              <w:spacing w:before="20" w:after="20" w:line="240" w:lineRule="auto"/>
+              <w:spacing w:before="40" w:after="40" w:line="240" w:lineRule="auto"/>
             </w:pPr>
             <w:r>
               <w:t xml:space="preserve">anti-PD-1</w:t>
@@ -1047,7 +1055,7 @@
             <w:pPr>
               <w:pStyle w:val="TableText"/>
               <w:jc w:val="left"/>
-              <w:spacing w:before="20" w:after="20" w:line="240" w:lineRule="auto"/>
+              <w:spacing w:before="40" w:after="40" w:line="240" w:lineRule="auto"/>
             </w:pPr>
             <w:r>
               <w:t xml:space="preserve">IPI+NIVO, pembrolizumab, nivolumab</w:t>
@@ -1067,7 +1075,7 @@
             <w:pPr>
               <w:pStyle w:val="TableText"/>
               <w:jc w:val="left"/>
-              <w:spacing w:before="20" w:after="20" w:line="240" w:lineRule="auto"/>
+              <w:spacing w:before="40" w:after="40" w:line="240" w:lineRule="auto"/>
             </w:pPr>
             <w:r>
               <w:t xml:space="preserve">Native endpoint</w:t>
@@ -1082,7 +1090,7 @@
             <w:pPr>
               <w:pStyle w:val="TableText"/>
               <w:jc w:val="left"/>
-              <w:spacing w:before="20" w:after="20" w:line="240" w:lineRule="auto"/>
+              <w:spacing w:before="40" w:after="40" w:line="240" w:lineRule="auto"/>
             </w:pPr>
             <w:r>
               <w:t xml:space="preserve">RECIST</w:t>
@@ -1097,7 +1105,7 @@
             <w:pPr>
               <w:pStyle w:val="TableText"/>
               <w:jc w:val="left"/>
-              <w:spacing w:before="20" w:after="20" w:line="240" w:lineRule="auto"/>
+              <w:spacing w:before="40" w:after="40" w:line="240" w:lineRule="auto"/>
             </w:pPr>
             <w:r>
               <w:t xml:space="preserve">RECIST</w:t>
@@ -1112,7 +1120,7 @@
             <w:pPr>
               <w:pStyle w:val="TableText"/>
               <w:jc w:val="left"/>
-              <w:spacing w:before="20" w:after="20" w:line="240" w:lineRule="auto"/>
+              <w:spacing w:before="40" w:after="40" w:line="240" w:lineRule="auto"/>
             </w:pPr>
             <w:r>
               <w:t xml:space="preserve">24-month long-term benefit (PFS-derived)</w:t>
@@ -1132,7 +1140,7 @@
             <w:pPr>
               <w:pStyle w:val="TableText"/>
               <w:jc w:val="left"/>
-              <w:spacing w:before="20" w:after="20" w:line="240" w:lineRule="auto"/>
+              <w:spacing w:before="40" w:after="40" w:line="240" w:lineRule="auto"/>
             </w:pPr>
             <w:r>
               <w:t xml:space="preserve">Endpoint used here</w:t>
@@ -1147,7 +1155,7 @@
             <w:pPr>
               <w:pStyle w:val="TableText"/>
               <w:jc w:val="left"/>
-              <w:spacing w:before="20" w:after="20" w:line="240" w:lineRule="auto"/>
+              <w:spacing w:before="40" w:after="40" w:line="240" w:lineRule="auto"/>
             </w:pPr>
             <w:r>
               <w:t xml:space="preserve">RECIST</w:t>
@@ -1162,7 +1170,7 @@
             <w:pPr>
               <w:pStyle w:val="TableText"/>
               <w:jc w:val="left"/>
-              <w:spacing w:before="20" w:after="20" w:line="240" w:lineRule="auto"/>
+              <w:spacing w:before="40" w:after="40" w:line="240" w:lineRule="auto"/>
             </w:pPr>
             <w:r>
               <w:t xml:space="preserve">RECIST</w:t>
@@ -1177,7 +1185,7 @@
             <w:pPr>
               <w:pStyle w:val="TableText"/>
               <w:jc w:val="left"/>
-              <w:spacing w:before="20" w:after="20" w:line="240" w:lineRule="auto"/>
+              <w:spacing w:before="40" w:after="40" w:line="240" w:lineRule="auto"/>
             </w:pPr>
             <w:r>
               <w:t xml:space="preserve">RECIST (derived from best overall response)</w:t>
@@ -1197,7 +1205,7 @@
             <w:pPr>
               <w:pStyle w:val="TableText"/>
               <w:jc w:val="left"/>
-              <w:spacing w:before="20" w:after="20" w:line="240" w:lineRule="auto"/>
+              <w:spacing w:before="40" w:after="40" w:line="240" w:lineRule="auto"/>
             </w:pPr>
             <w:r>
               <w:t xml:space="preserve">Relation to IMPRES derivation</w:t>
@@ -1212,7 +1220,7 @@
             <w:pPr>
               <w:pStyle w:val="TableText"/>
               <w:jc w:val="left"/>
-              <w:spacing w:before="20" w:after="20" w:line="240" w:lineRule="auto"/>
+              <w:spacing w:before="40" w:after="40" w:line="240" w:lineRule="auto"/>
             </w:pPr>
             <w:r>
               <w:t xml:space="preserve">reported validation cohort</w:t>
@@ -1227,7 +1235,7 @@
             <w:pPr>
               <w:pStyle w:val="TableText"/>
               <w:jc w:val="left"/>
-              <w:spacing w:before="20" w:after="20" w:line="240" w:lineRule="auto"/>
+              <w:spacing w:before="40" w:after="40" w:line="240" w:lineRule="auto"/>
             </w:pPr>
             <w:r>
               <w:t xml:space="preserve">none</w:t>
@@ -1242,7 +1250,7 @@
             <w:pPr>
               <w:pStyle w:val="TableText"/>
               <w:jc w:val="left"/>
-              <w:spacing w:before="20" w:after="20" w:line="240" w:lineRule="auto"/>
+              <w:spacing w:before="40" w:after="40" w:line="240" w:lineRule="auto"/>
             </w:pPr>
             <w:r>
               <w:t xml:space="preserve">none</w:t>
@@ -1334,7 +1342,7 @@
                     <pic:cNvPicPr/>
                   </pic:nvPicPr>
                   <pic:blipFill>
-                    <a:blip xmlns:r="http://schemas.openxmlformats.org/officeDocument/2006/relationships" r:embed="R853a289c25894a72"/>
+                    <a:blip xmlns:r="http://schemas.openxmlformats.org/officeDocument/2006/relationships" r:embed="Rf0292846e9cc4662"/>
                     <a:stretch>
                       <a:fillRect/>
                     </a:stretch>
@@ -1381,11 +1389,11 @@
       <w:tblPr>
         <w:tblW w:w="5000" w:type="pct"/>
         <w:tblBorders>
-          <w:top w:val="single" w:sz="8" w:space="0"/>
-          <w:bottom w:val="single" w:sz="8" w:space="0"/>
+          <w:top w:val="single" w:sz="16" w:space="0"/>
+          <w:bottom w:val="single" w:sz="16" w:space="0"/>
           <w:left w:val="none"/>
           <w:right w:val="none"/>
-          <w:insideH w:val="single" w:sz="4" w:space="0"/>
+          <w:insideH w:val="none"/>
           <w:insideV w:val="none"/>
         </w:tblBorders>
         <w:tblCellMar>
@@ -1408,13 +1416,15 @@
         <w:tc>
           <w:tcPr>
             <w:tcW w:w="3008" w:type="dxa"/>
-            <w:shd w:val="clear" w:color="auto" w:fill="F2F2F2"/>
-          </w:tcPr>
-          <w:p>
-            <w:pPr>
-              <w:pStyle w:val="TableText"/>
-              <w:jc w:val="left"/>
-              <w:spacing w:before="20" w:after="20" w:line="240" w:lineRule="auto"/>
+            <w:tcBorders>
+              <w:bottom w:val="single" w:sz="8" w:space="0"/>
+            </w:tcBorders>
+          </w:tcPr>
+          <w:p>
+            <w:pPr>
+              <w:pStyle w:val="TableText"/>
+              <w:jc w:val="left"/>
+              <w:spacing w:before="40" w:after="40" w:line="240" w:lineRule="auto"/>
             </w:pPr>
             <w:r>
               <w:rPr>
@@ -1427,13 +1437,15 @@
         <w:tc>
           <w:tcPr>
             <w:tcW w:w="3008" w:type="dxa"/>
-            <w:shd w:val="clear" w:color="auto" w:fill="F2F2F2"/>
-          </w:tcPr>
-          <w:p>
-            <w:pPr>
-              <w:pStyle w:val="TableText"/>
-              <w:jc w:val="left"/>
-              <w:spacing w:before="20" w:after="20" w:line="240" w:lineRule="auto"/>
+            <w:tcBorders>
+              <w:bottom w:val="single" w:sz="8" w:space="0"/>
+            </w:tcBorders>
+          </w:tcPr>
+          <w:p>
+            <w:pPr>
+              <w:pStyle w:val="TableText"/>
+              <w:jc w:val="left"/>
+              <w:spacing w:before="40" w:after="40" w:line="240" w:lineRule="auto"/>
             </w:pPr>
             <w:r>
               <w:rPr>
@@ -1446,13 +1458,15 @@
         <w:tc>
           <w:tcPr>
             <w:tcW w:w="3010" w:type="dxa"/>
-            <w:shd w:val="clear" w:color="auto" w:fill="F2F2F2"/>
-          </w:tcPr>
-          <w:p>
-            <w:pPr>
-              <w:pStyle w:val="TableText"/>
-              <w:jc w:val="left"/>
-              <w:spacing w:before="20" w:after="20" w:line="240" w:lineRule="auto"/>
+            <w:tcBorders>
+              <w:bottom w:val="single" w:sz="8" w:space="0"/>
+            </w:tcBorders>
+          </w:tcPr>
+          <w:p>
+            <w:pPr>
+              <w:pStyle w:val="TableText"/>
+              <w:jc w:val="left"/>
+              <w:spacing w:before="40" w:after="40" w:line="240" w:lineRule="auto"/>
             </w:pPr>
             <w:r>
               <w:rPr>
@@ -1475,7 +1489,7 @@
             <w:pPr>
               <w:pStyle w:val="TableText"/>
               <w:jc w:val="left"/>
-              <w:spacing w:before="20" w:after="20" w:line="240" w:lineRule="auto"/>
+              <w:spacing w:before="40" w:after="40" w:line="240" w:lineRule="auto"/>
             </w:pPr>
             <w:r>
               <w:t xml:space="preserve">Pooled out-of-fold AUC</w:t>
@@ -1490,7 +1504,7 @@
             <w:pPr>
               <w:pStyle w:val="TableText"/>
               <w:jc w:val="left"/>
-              <w:spacing w:before="20" w:after="20" w:line="240" w:lineRule="auto"/>
+              <w:spacing w:before="40" w:after="40" w:line="240" w:lineRule="auto"/>
             </w:pPr>
             <w:r>
               <w:t xml:space="preserve">0.417</w:t>
@@ -1505,7 +1519,7 @@
             <w:pPr>
               <w:pStyle w:val="TableText"/>
               <w:jc w:val="left"/>
-              <w:spacing w:before="20" w:after="20" w:line="240" w:lineRule="auto"/>
+              <w:spacing w:before="40" w:after="40" w:line="240" w:lineRule="auto"/>
             </w:pPr>
             <w:r>
               <w:t xml:space="preserve">0.500</w:t>
@@ -1525,7 +1539,7 @@
             <w:pPr>
               <w:pStyle w:val="TableText"/>
               <w:jc w:val="left"/>
-              <w:spacing w:before="20" w:after="20" w:line="240" w:lineRule="auto"/>
+              <w:spacing w:before="40" w:after="40" w:line="240" w:lineRule="auto"/>
             </w:pPr>
             <w:r>
               <w:t xml:space="preserve">Mean across repeats ± SD</w:t>
@@ -1540,7 +1554,7 @@
             <w:pPr>
               <w:pStyle w:val="TableText"/>
               <w:jc w:val="left"/>
-              <w:spacing w:before="20" w:after="20" w:line="240" w:lineRule="auto"/>
+              <w:spacing w:before="40" w:after="40" w:line="240" w:lineRule="auto"/>
             </w:pPr>
             <w:r>
               <w:t xml:space="preserve">0.408 ± 0.046</w:t>
@@ -1555,7 +1569,7 @@
             <w:pPr>
               <w:pStyle w:val="TableText"/>
               <w:jc w:val="left"/>
-              <w:spacing w:before="20" w:after="20" w:line="240" w:lineRule="auto"/>
+              <w:spacing w:before="40" w:after="40" w:line="240" w:lineRule="auto"/>
             </w:pPr>
             <w:r>
               <w:t xml:space="preserve">0.516 ± 0.112</w:t>
@@ -1575,7 +1589,7 @@
             <w:pPr>
               <w:pStyle w:val="TableText"/>
               <w:jc w:val="left"/>
-              <w:spacing w:before="20" w:after="20" w:line="240" w:lineRule="auto"/>
+              <w:spacing w:before="40" w:after="40" w:line="240" w:lineRule="auto"/>
             </w:pPr>
             <w:r>
               <w:t xml:space="preserve">Mean across outer folds ± SD</w:t>
@@ -1590,7 +1604,7 @@
             <w:pPr>
               <w:pStyle w:val="TableText"/>
               <w:jc w:val="left"/>
-              <w:spacing w:before="20" w:after="20" w:line="240" w:lineRule="auto"/>
+              <w:spacing w:before="40" w:after="40" w:line="240" w:lineRule="auto"/>
             </w:pPr>
             <w:r>
               <w:t xml:space="preserve">0.347 ± 0.213</w:t>
@@ -1605,7 +1619,7 @@
             <w:pPr>
               <w:pStyle w:val="TableText"/>
               <w:jc w:val="left"/>
-              <w:spacing w:before="20" w:after="20" w:line="240" w:lineRule="auto"/>
+              <w:spacing w:before="40" w:after="40" w:line="240" w:lineRule="auto"/>
             </w:pPr>
             <w:r>
               <w:t xml:space="preserve">0.549 ± 0.257</w:t>
@@ -1705,7 +1719,7 @@
                     <pic:cNvPicPr/>
                   </pic:nvPicPr>
                   <pic:blipFill>
-                    <a:blip xmlns:r="http://schemas.openxmlformats.org/officeDocument/2006/relationships" r:embed="Rba0c81ca52964fd7"/>
+                    <a:blip xmlns:r="http://schemas.openxmlformats.org/officeDocument/2006/relationships" r:embed="R7a9d40ca75a24fc6"/>
                     <a:stretch>
                       <a:fillRect/>
                     </a:stretch>
@@ -1752,11 +1766,11 @@
       <w:tblPr>
         <w:tblW w:w="5000" w:type="pct"/>
         <w:tblBorders>
-          <w:top w:val="single" w:sz="8" w:space="0"/>
-          <w:bottom w:val="single" w:sz="8" w:space="0"/>
+          <w:top w:val="single" w:sz="16" w:space="0"/>
+          <w:bottom w:val="single" w:sz="16" w:space="0"/>
           <w:left w:val="none"/>
           <w:right w:val="none"/>
-          <w:insideH w:val="single" w:sz="4" w:space="0"/>
+          <w:insideH w:val="none"/>
           <w:insideV w:val="none"/>
         </w:tblBorders>
         <w:tblCellMar>
@@ -1784,13 +1798,15 @@
         <w:tc>
           <w:tcPr>
             <w:tcW w:w="2108" w:type="dxa"/>
-            <w:shd w:val="clear" w:color="auto" w:fill="F2F2F2"/>
-          </w:tcPr>
-          <w:p>
-            <w:pPr>
-              <w:pStyle w:val="TableText"/>
-              <w:jc w:val="left"/>
-              <w:spacing w:before="20" w:after="20" w:line="240" w:lineRule="auto"/>
+            <w:tcBorders>
+              <w:bottom w:val="single" w:sz="8" w:space="0"/>
+            </w:tcBorders>
+          </w:tcPr>
+          <w:p>
+            <w:pPr>
+              <w:pStyle w:val="TableText"/>
+              <w:jc w:val="left"/>
+              <w:spacing w:before="40" w:after="40" w:line="240" w:lineRule="auto"/>
             </w:pPr>
             <w:r>
               <w:rPr>
@@ -1803,13 +1819,15 @@
         <w:tc>
           <w:tcPr>
             <w:tcW w:w="1138" w:type="dxa"/>
-            <w:shd w:val="clear" w:color="auto" w:fill="F2F2F2"/>
-          </w:tcPr>
-          <w:p>
-            <w:pPr>
-              <w:pStyle w:val="TableText"/>
-              <w:jc w:val="left"/>
-              <w:spacing w:before="20" w:after="20" w:line="240" w:lineRule="auto"/>
+            <w:tcBorders>
+              <w:bottom w:val="single" w:sz="8" w:space="0"/>
+            </w:tcBorders>
+          </w:tcPr>
+          <w:p>
+            <w:pPr>
+              <w:pStyle w:val="TableText"/>
+              <w:jc w:val="left"/>
+              <w:spacing w:before="40" w:after="40" w:line="240" w:lineRule="auto"/>
             </w:pPr>
             <w:r>
               <w:rPr>
@@ -1822,13 +1840,15 @@
         <w:tc>
           <w:tcPr>
             <w:tcW w:w="1138" w:type="dxa"/>
-            <w:shd w:val="clear" w:color="auto" w:fill="F2F2F2"/>
-          </w:tcPr>
-          <w:p>
-            <w:pPr>
-              <w:pStyle w:val="TableText"/>
-              <w:jc w:val="left"/>
-              <w:spacing w:before="20" w:after="20" w:line="240" w:lineRule="auto"/>
+            <w:tcBorders>
+              <w:bottom w:val="single" w:sz="8" w:space="0"/>
+            </w:tcBorders>
+          </w:tcPr>
+          <w:p>
+            <w:pPr>
+              <w:pStyle w:val="TableText"/>
+              <w:jc w:val="left"/>
+              <w:spacing w:before="40" w:after="40" w:line="240" w:lineRule="auto"/>
             </w:pPr>
             <w:r>
               <w:rPr>
@@ -1841,13 +1861,15 @@
         <w:tc>
           <w:tcPr>
             <w:tcW w:w="1138" w:type="dxa"/>
-            <w:shd w:val="clear" w:color="auto" w:fill="F2F2F2"/>
-          </w:tcPr>
-          <w:p>
-            <w:pPr>
-              <w:pStyle w:val="TableText"/>
-              <w:jc w:val="left"/>
-              <w:spacing w:before="20" w:after="20" w:line="240" w:lineRule="auto"/>
+            <w:tcBorders>
+              <w:bottom w:val="single" w:sz="8" w:space="0"/>
+            </w:tcBorders>
+          </w:tcPr>
+          <w:p>
+            <w:pPr>
+              <w:pStyle w:val="TableText"/>
+              <w:jc w:val="left"/>
+              <w:spacing w:before="40" w:after="40" w:line="240" w:lineRule="auto"/>
             </w:pPr>
             <w:r>
               <w:rPr>
@@ -1860,13 +1882,15 @@
         <w:tc>
           <w:tcPr>
             <w:tcW w:w="1265" w:type="dxa"/>
-            <w:shd w:val="clear" w:color="auto" w:fill="F2F2F2"/>
-          </w:tcPr>
-          <w:p>
-            <w:pPr>
-              <w:pStyle w:val="TableText"/>
-              <w:jc w:val="left"/>
-              <w:spacing w:before="20" w:after="20" w:line="240" w:lineRule="auto"/>
+            <w:tcBorders>
+              <w:bottom w:val="single" w:sz="8" w:space="0"/>
+            </w:tcBorders>
+          </w:tcPr>
+          <w:p>
+            <w:pPr>
+              <w:pStyle w:val="TableText"/>
+              <w:jc w:val="left"/>
+              <w:spacing w:before="40" w:after="40" w:line="240" w:lineRule="auto"/>
             </w:pPr>
             <w:r>
               <w:rPr>
@@ -1879,13 +1903,15 @@
         <w:tc>
           <w:tcPr>
             <w:tcW w:w="674" w:type="dxa"/>
-            <w:shd w:val="clear" w:color="auto" w:fill="F2F2F2"/>
-          </w:tcPr>
-          <w:p>
-            <w:pPr>
-              <w:pStyle w:val="TableText"/>
-              <w:jc w:val="left"/>
-              <w:spacing w:before="20" w:after="20" w:line="240" w:lineRule="auto"/>
+            <w:tcBorders>
+              <w:bottom w:val="single" w:sz="8" w:space="0"/>
+            </w:tcBorders>
+          </w:tcPr>
+          <w:p>
+            <w:pPr>
+              <w:pStyle w:val="TableText"/>
+              <w:jc w:val="left"/>
+              <w:spacing w:before="40" w:after="40" w:line="240" w:lineRule="auto"/>
             </w:pPr>
             <w:r>
               <w:rPr>
@@ -1898,13 +1924,15 @@
         <w:tc>
           <w:tcPr>
             <w:tcW w:w="759" w:type="dxa"/>
-            <w:shd w:val="clear" w:color="auto" w:fill="F2F2F2"/>
-          </w:tcPr>
-          <w:p>
-            <w:pPr>
-              <w:pStyle w:val="TableText"/>
-              <w:jc w:val="left"/>
-              <w:spacing w:before="20" w:after="20" w:line="240" w:lineRule="auto"/>
+            <w:tcBorders>
+              <w:bottom w:val="single" w:sz="8" w:space="0"/>
+            </w:tcBorders>
+          </w:tcPr>
+          <w:p>
+            <w:pPr>
+              <w:pStyle w:val="TableText"/>
+              <w:jc w:val="left"/>
+              <w:spacing w:before="40" w:after="40" w:line="240" w:lineRule="auto"/>
             </w:pPr>
             <w:r>
               <w:rPr>
@@ -1917,13 +1945,15 @@
         <w:tc>
           <w:tcPr>
             <w:tcW w:w="806" w:type="dxa"/>
-            <w:shd w:val="clear" w:color="auto" w:fill="F2F2F2"/>
-          </w:tcPr>
-          <w:p>
-            <w:pPr>
-              <w:pStyle w:val="TableText"/>
-              <w:jc w:val="left"/>
-              <w:spacing w:before="20" w:after="20" w:line="240" w:lineRule="auto"/>
+            <w:tcBorders>
+              <w:bottom w:val="single" w:sz="8" w:space="0"/>
+            </w:tcBorders>
+          </w:tcPr>
+          <w:p>
+            <w:pPr>
+              <w:pStyle w:val="TableText"/>
+              <w:jc w:val="left"/>
+              <w:spacing w:before="40" w:after="40" w:line="240" w:lineRule="auto"/>
             </w:pPr>
             <w:r>
               <w:rPr>
@@ -1946,7 +1976,7 @@
             <w:pPr>
               <w:pStyle w:val="TableText"/>
               <w:jc w:val="left"/>
-              <w:spacing w:before="20" w:after="20" w:line="240" w:lineRule="auto"/>
+              <w:spacing w:before="40" w:after="40" w:line="240" w:lineRule="auto"/>
             </w:pPr>
             <w:r>
               <w:t xml:space="preserve">IMPRES, pre-registered direction</w:t>
@@ -1961,7 +1991,7 @@
             <w:pPr>
               <w:pStyle w:val="TableText"/>
               <w:jc w:val="left"/>
-              <w:spacing w:before="20" w:after="20" w:line="240" w:lineRule="auto"/>
+              <w:spacing w:before="40" w:after="40" w:line="240" w:lineRule="auto"/>
             </w:pPr>
             <w:r>
               <w:t xml:space="preserve">0.359 (0.172–0.552)</w:t>
@@ -1976,7 +2006,7 @@
             <w:pPr>
               <w:pStyle w:val="TableText"/>
               <w:jc w:val="left"/>
-              <w:spacing w:before="20" w:after="20" w:line="240" w:lineRule="auto"/>
+              <w:spacing w:before="40" w:after="40" w:line="240" w:lineRule="auto"/>
             </w:pPr>
             <w:r>
               <w:t xml:space="preserve">0.298 (0.122–0.521)</w:t>
@@ -1991,7 +2021,7 @@
             <w:pPr>
               <w:pStyle w:val="TableText"/>
               <w:jc w:val="left"/>
-              <w:spacing w:before="20" w:after="20" w:line="240" w:lineRule="auto"/>
+              <w:spacing w:before="40" w:after="40" w:line="240" w:lineRule="auto"/>
             </w:pPr>
             <w:r>
               <w:t xml:space="preserve">0.505 (0.380–0.631)</w:t>
@@ -2006,7 +2036,7 @@
             <w:pPr>
               <w:pStyle w:val="TableText"/>
               <w:jc w:val="left"/>
-              <w:spacing w:before="20" w:after="20" w:line="240" w:lineRule="auto"/>
+              <w:spacing w:before="40" w:after="40" w:line="240" w:lineRule="auto"/>
             </w:pPr>
             <w:r>
               <w:t xml:space="preserve">0.415 (0.293–0.549)</w:t>
@@ -2021,7 +2051,7 @@
             <w:pPr>
               <w:pStyle w:val="TableText"/>
               <w:jc w:val="left"/>
-              <w:spacing w:before="20" w:after="20" w:line="240" w:lineRule="auto"/>
+              <w:spacing w:before="40" w:after="40" w:line="240" w:lineRule="auto"/>
             </w:pPr>
             <w:r>
               <w:t xml:space="preserve">34.6%</w:t>
@@ -2036,7 +2066,7 @@
             <w:pPr>
               <w:pStyle w:val="TableText"/>
               <w:jc w:val="left"/>
-              <w:spacing w:before="20" w:after="20" w:line="240" w:lineRule="auto"/>
+              <w:spacing w:before="40" w:after="40" w:line="240" w:lineRule="auto"/>
             </w:pPr>
             <w:r>
               <w:t xml:space="preserve">0.213</w:t>
@@ -2051,7 +2081,7 @@
             <w:pPr>
               <w:pStyle w:val="TableText"/>
               <w:jc w:val="left"/>
-              <w:spacing w:before="20" w:after="20" w:line="240" w:lineRule="auto"/>
+              <w:spacing w:before="40" w:after="40" w:line="240" w:lineRule="auto"/>
             </w:pPr>
             <w:r>
               <w:t xml:space="preserve">1.00</w:t>
@@ -2071,7 +2101,7 @@
             <w:pPr>
               <w:pStyle w:val="TableText"/>
               <w:jc w:val="left"/>
-              <w:spacing w:before="20" w:after="20" w:line="240" w:lineRule="auto"/>
+              <w:spacing w:before="40" w:after="40" w:line="240" w:lineRule="auto"/>
             </w:pPr>
             <w:r>
               <w:t xml:space="preserve">IMPRES, mirrored</w:t>
@@ -2086,7 +2116,7 @@
             <w:pPr>
               <w:pStyle w:val="TableText"/>
               <w:jc w:val="left"/>
-              <w:spacing w:before="20" w:after="20" w:line="240" w:lineRule="auto"/>
+              <w:spacing w:before="40" w:after="40" w:line="240" w:lineRule="auto"/>
             </w:pPr>
             <w:r>
               <w:t xml:space="preserve">0.659 (0.452–0.843)</w:t>
@@ -2101,7 +2131,7 @@
             <w:pPr>
               <w:pStyle w:val="TableText"/>
               <w:jc w:val="left"/>
-              <w:spacing w:before="20" w:after="20" w:line="240" w:lineRule="auto"/>
+              <w:spacing w:before="40" w:after="40" w:line="240" w:lineRule="auto"/>
             </w:pPr>
             <w:r>
               <w:t xml:space="preserve">0.583 (0.351–0.786)</w:t>
@@ -2116,7 +2146,7 @@
             <w:pPr>
               <w:pStyle w:val="TableText"/>
               <w:jc w:val="left"/>
-              <w:spacing w:before="20" w:after="20" w:line="240" w:lineRule="auto"/>
+              <w:spacing w:before="40" w:after="40" w:line="240" w:lineRule="auto"/>
             </w:pPr>
             <w:r>
               <w:t xml:space="preserve">0.483 (0.358–0.608)</w:t>
@@ -2131,7 +2161,7 @@
             <w:pPr>
               <w:pStyle w:val="TableText"/>
               <w:jc w:val="left"/>
-              <w:spacing w:before="20" w:after="20" w:line="240" w:lineRule="auto"/>
+              <w:spacing w:before="40" w:after="40" w:line="240" w:lineRule="auto"/>
             </w:pPr>
             <w:r>
               <w:t xml:space="preserve">0.537 (0.435–0.635)</w:t>
@@ -2146,7 +2176,7 @@
             <w:pPr>
               <w:pStyle w:val="TableText"/>
               <w:jc w:val="left"/>
-              <w:spacing w:before="20" w:after="20" w:line="240" w:lineRule="auto"/>
+              <w:spacing w:before="40" w:after="40" w:line="240" w:lineRule="auto"/>
             </w:pPr>
             <w:r>
               <w:t xml:space="preserve">0.0%</w:t>
@@ -2161,7 +2191,7 @@
             <w:pPr>
               <w:pStyle w:val="TableText"/>
               <w:jc w:val="left"/>
-              <w:spacing w:before="20" w:after="20" w:line="240" w:lineRule="auto"/>
+              <w:spacing w:before="40" w:after="40" w:line="240" w:lineRule="auto"/>
             </w:pPr>
             <w:r>
               <w:t xml:space="preserve">0.480</w:t>
@@ -2176,7 +2206,7 @@
             <w:pPr>
               <w:pStyle w:val="TableText"/>
               <w:jc w:val="left"/>
-              <w:spacing w:before="20" w:after="20" w:line="240" w:lineRule="auto"/>
+              <w:spacing w:before="40" w:after="40" w:line="240" w:lineRule="auto"/>
             </w:pPr>
             <w:r>
               <w:t xml:space="preserve">1.00</w:t>
@@ -2196,7 +2226,7 @@
             <w:pPr>
               <w:pStyle w:val="TableText"/>
               <w:jc w:val="left"/>
-              <w:spacing w:before="20" w:after="20" w:line="240" w:lineRule="auto"/>
+              <w:spacing w:before="40" w:after="40" w:line="240" w:lineRule="auto"/>
             </w:pPr>
             <w:r>
               <w:t xml:space="preserve">IPS-MHC+CP, high-score direction</w:t>
@@ -2211,7 +2241,7 @@
             <w:pPr>
               <w:pStyle w:val="TableText"/>
               <w:jc w:val="left"/>
-              <w:spacing w:before="20" w:after="20" w:line="240" w:lineRule="auto"/>
+              <w:spacing w:before="40" w:after="40" w:line="240" w:lineRule="auto"/>
             </w:pPr>
             <w:r>
               <w:t xml:space="preserve">0.604 (0.365–0.822)</w:t>
@@ -2226,7 +2256,7 @@
             <w:pPr>
               <w:pStyle w:val="TableText"/>
               <w:jc w:val="left"/>
-              <w:spacing w:before="20" w:after="20" w:line="240" w:lineRule="auto"/>
+              <w:spacing w:before="40" w:after="40" w:line="240" w:lineRule="auto"/>
             </w:pPr>
             <w:r>
               <w:t xml:space="preserve">0.583 (0.339–0.821)</w:t>
@@ -2241,7 +2271,7 @@
             <w:pPr>
               <w:pStyle w:val="TableText"/>
               <w:jc w:val="left"/>
-              <w:spacing w:before="20" w:after="20" w:line="240" w:lineRule="auto"/>
+              <w:spacing w:before="40" w:after="40" w:line="240" w:lineRule="auto"/>
             </w:pPr>
             <w:r>
               <w:t xml:space="preserve">0.591 (0.463–0.714)</w:t>
@@ -2256,7 +2286,7 @@
             <w:pPr>
               <w:pStyle w:val="TableText"/>
               <w:jc w:val="left"/>
-              <w:spacing w:before="20" w:after="20" w:line="240" w:lineRule="auto"/>
+              <w:spacing w:before="40" w:after="40" w:line="240" w:lineRule="auto"/>
             </w:pPr>
             <w:r>
               <w:t xml:space="preserve">0.592 (0.492–0.685)</w:t>
@@ -2271,7 +2301,7 @@
             <w:pPr>
               <w:pStyle w:val="TableText"/>
               <w:jc w:val="left"/>
-              <w:spacing w:before="20" w:after="20" w:line="240" w:lineRule="auto"/>
+              <w:spacing w:before="40" w:after="40" w:line="240" w:lineRule="auto"/>
             </w:pPr>
             <w:r>
               <w:t xml:space="preserve">0.0%</w:t>
@@ -2286,7 +2316,7 @@
             <w:pPr>
               <w:pStyle w:val="TableText"/>
               <w:jc w:val="left"/>
-              <w:spacing w:before="20" w:after="20" w:line="240" w:lineRule="auto"/>
+              <w:spacing w:before="40" w:after="40" w:line="240" w:lineRule="auto"/>
             </w:pPr>
             <w:r>
               <w:t xml:space="preserve">0.071</w:t>
@@ -2301,7 +2331,7 @@
             <w:pPr>
               <w:pStyle w:val="TableText"/>
               <w:jc w:val="left"/>
-              <w:spacing w:before="20" w:after="20" w:line="240" w:lineRule="auto"/>
+              <w:spacing w:before="40" w:after="40" w:line="240" w:lineRule="auto"/>
             </w:pPr>
             <w:r>
               <w:t xml:space="preserve">0.25</w:t>
@@ -2321,7 +2351,7 @@
             <w:pPr>
               <w:pStyle w:val="TableText"/>
               <w:jc w:val="left"/>
-              <w:spacing w:before="20" w:after="20" w:line="240" w:lineRule="auto"/>
+              <w:spacing w:before="40" w:after="40" w:line="240" w:lineRule="auto"/>
             </w:pPr>
             <w:r>
               <w:t xml:space="preserve">IPS-MHC+CP, mirrored</w:t>
@@ -2336,7 +2366,7 @@
             <w:pPr>
               <w:pStyle w:val="TableText"/>
               <w:jc w:val="left"/>
-              <w:spacing w:before="20" w:after="20" w:line="240" w:lineRule="auto"/>
+              <w:spacing w:before="40" w:after="40" w:line="240" w:lineRule="auto"/>
             </w:pPr>
             <w:r>
               <w:t xml:space="preserve">0.396 (0.178–0.626)</w:t>
@@ -2351,7 +2381,7 @@
             <w:pPr>
               <w:pStyle w:val="TableText"/>
               <w:jc w:val="left"/>
-              <w:spacing w:before="20" w:after="20" w:line="240" w:lineRule="auto"/>
+              <w:spacing w:before="40" w:after="40" w:line="240" w:lineRule="auto"/>
             </w:pPr>
             <w:r>
               <w:t xml:space="preserve">0.417 (0.190–0.661)</w:t>
@@ -2366,7 +2396,7 @@
             <w:pPr>
               <w:pStyle w:val="TableText"/>
               <w:jc w:val="left"/>
-              <w:spacing w:before="20" w:after="20" w:line="240" w:lineRule="auto"/>
+              <w:spacing w:before="40" w:after="40" w:line="240" w:lineRule="auto"/>
             </w:pPr>
             <w:r>
               <w:t xml:space="preserve">0.409 (0.288–0.541)</w:t>
@@ -2381,7 +2411,7 @@
             <w:pPr>
               <w:pStyle w:val="TableText"/>
               <w:jc w:val="left"/>
-              <w:spacing w:before="20" w:after="20" w:line="240" w:lineRule="auto"/>
+              <w:spacing w:before="40" w:after="40" w:line="240" w:lineRule="auto"/>
             </w:pPr>
             <w:r>
               <w:t xml:space="preserve">not pooled</w:t>
@@ -2396,7 +2426,7 @@
             <w:pPr>
               <w:pStyle w:val="TableText"/>
               <w:jc w:val="left"/>
-              <w:spacing w:before="20" w:after="20" w:line="240" w:lineRule="auto"/>
+              <w:spacing w:before="40" w:after="40" w:line="240" w:lineRule="auto"/>
             </w:pPr>
             <w:r>
               <w:t xml:space="preserve">—</w:t>
@@ -2411,7 +2441,7 @@
             <w:pPr>
               <w:pStyle w:val="TableText"/>
               <w:jc w:val="left"/>
-              <w:spacing w:before="20" w:after="20" w:line="240" w:lineRule="auto"/>
+              <w:spacing w:before="40" w:after="40" w:line="240" w:lineRule="auto"/>
             </w:pPr>
             <w:r>
               <w:t xml:space="preserve">—</w:t>
@@ -2426,7 +2456,7 @@
             <w:pPr>
               <w:pStyle w:val="TableText"/>
               <w:jc w:val="left"/>
-              <w:spacing w:before="20" w:after="20" w:line="240" w:lineRule="auto"/>
+              <w:spacing w:before="40" w:after="40" w:line="240" w:lineRule="auto"/>
             </w:pPr>
             <w:r>
               <w:t xml:space="preserve">0.25</w:t>
@@ -2482,11 +2512,11 @@
       <w:tblPr>
         <w:tblW w:w="5000" w:type="pct"/>
         <w:tblBorders>
-          <w:top w:val="single" w:sz="8" w:space="0"/>
-          <w:bottom w:val="single" w:sz="8" w:space="0"/>
+          <w:top w:val="single" w:sz="16" w:space="0"/>
+          <w:bottom w:val="single" w:sz="16" w:space="0"/>
           <w:left w:val="none"/>
           <w:right w:val="none"/>
-          <w:insideH w:val="single" w:sz="4" w:space="0"/>
+          <w:insideH w:val="none"/>
           <w:insideV w:val="none"/>
         </w:tblBorders>
         <w:tblCellMar>
@@ -2511,13 +2541,15 @@
         <w:tc>
           <w:tcPr>
             <w:tcW w:w="1805" w:type="dxa"/>
-            <w:shd w:val="clear" w:color="auto" w:fill="F2F2F2"/>
-          </w:tcPr>
-          <w:p>
-            <w:pPr>
-              <w:pStyle w:val="TableText"/>
-              <w:jc w:val="left"/>
-              <w:spacing w:before="20" w:after="20" w:line="240" w:lineRule="auto"/>
+            <w:tcBorders>
+              <w:bottom w:val="single" w:sz="8" w:space="0"/>
+            </w:tcBorders>
+          </w:tcPr>
+          <w:p>
+            <w:pPr>
+              <w:pStyle w:val="TableText"/>
+              <w:jc w:val="left"/>
+              <w:spacing w:before="40" w:after="40" w:line="240" w:lineRule="auto"/>
             </w:pPr>
             <w:r>
               <w:rPr>
@@ -2530,13 +2562,15 @@
         <w:tc>
           <w:tcPr>
             <w:tcW w:w="1805" w:type="dxa"/>
-            <w:shd w:val="clear" w:color="auto" w:fill="F2F2F2"/>
-          </w:tcPr>
-          <w:p>
-            <w:pPr>
-              <w:pStyle w:val="TableText"/>
-              <w:jc w:val="left"/>
-              <w:spacing w:before="20" w:after="20" w:line="240" w:lineRule="auto"/>
+            <w:tcBorders>
+              <w:bottom w:val="single" w:sz="8" w:space="0"/>
+            </w:tcBorders>
+          </w:tcPr>
+          <w:p>
+            <w:pPr>
+              <w:pStyle w:val="TableText"/>
+              <w:jc w:val="left"/>
+              <w:spacing w:before="40" w:after="40" w:line="240" w:lineRule="auto"/>
             </w:pPr>
             <w:r>
               <w:rPr>
@@ -2549,13 +2583,15 @@
         <w:tc>
           <w:tcPr>
             <w:tcW w:w="1805" w:type="dxa"/>
-            <w:shd w:val="clear" w:color="auto" w:fill="F2F2F2"/>
-          </w:tcPr>
-          <w:p>
-            <w:pPr>
-              <w:pStyle w:val="TableText"/>
-              <w:jc w:val="left"/>
-              <w:spacing w:before="20" w:after="20" w:line="240" w:lineRule="auto"/>
+            <w:tcBorders>
+              <w:bottom w:val="single" w:sz="8" w:space="0"/>
+            </w:tcBorders>
+          </w:tcPr>
+          <w:p>
+            <w:pPr>
+              <w:pStyle w:val="TableText"/>
+              <w:jc w:val="left"/>
+              <w:spacing w:before="40" w:after="40" w:line="240" w:lineRule="auto"/>
             </w:pPr>
             <w:r>
               <w:rPr>
@@ -2568,13 +2604,15 @@
         <w:tc>
           <w:tcPr>
             <w:tcW w:w="1805" w:type="dxa"/>
-            <w:shd w:val="clear" w:color="auto" w:fill="F2F2F2"/>
-          </w:tcPr>
-          <w:p>
-            <w:pPr>
-              <w:pStyle w:val="TableText"/>
-              <w:jc w:val="left"/>
-              <w:spacing w:before="20" w:after="20" w:line="240" w:lineRule="auto"/>
+            <w:tcBorders>
+              <w:bottom w:val="single" w:sz="8" w:space="0"/>
+            </w:tcBorders>
+          </w:tcPr>
+          <w:p>
+            <w:pPr>
+              <w:pStyle w:val="TableText"/>
+              <w:jc w:val="left"/>
+              <w:spacing w:before="40" w:after="40" w:line="240" w:lineRule="auto"/>
             </w:pPr>
             <w:r>
               <w:rPr>
@@ -2587,13 +2625,15 @@
         <w:tc>
           <w:tcPr>
             <w:tcW w:w="1806" w:type="dxa"/>
-            <w:shd w:val="clear" w:color="auto" w:fill="F2F2F2"/>
-          </w:tcPr>
-          <w:p>
-            <w:pPr>
-              <w:pStyle w:val="TableText"/>
-              <w:jc w:val="left"/>
-              <w:spacing w:before="20" w:after="20" w:line="240" w:lineRule="auto"/>
+            <w:tcBorders>
+              <w:bottom w:val="single" w:sz="8" w:space="0"/>
+            </w:tcBorders>
+          </w:tcPr>
+          <w:p>
+            <w:pPr>
+              <w:pStyle w:val="TableText"/>
+              <w:jc w:val="left"/>
+              <w:spacing w:before="40" w:after="40" w:line="240" w:lineRule="auto"/>
             </w:pPr>
             <w:r>
               <w:rPr>
@@ -2616,7 +2656,7 @@
             <w:pPr>
               <w:pStyle w:val="TableText"/>
               <w:jc w:val="left"/>
-              <w:spacing w:before="20" w:after="20" w:line="240" w:lineRule="auto"/>
+              <w:spacing w:before="40" w:after="40" w:line="240" w:lineRule="auto"/>
             </w:pPr>
             <w:r>
               <w:t xml:space="preserve">Power</w:t>
@@ -2631,7 +2671,7 @@
             <w:pPr>
               <w:pStyle w:val="TableText"/>
               <w:jc w:val="left"/>
-              <w:spacing w:before="20" w:after="20" w:line="240" w:lineRule="auto"/>
+              <w:spacing w:before="40" w:after="40" w:line="240" w:lineRule="auto"/>
             </w:pPr>
             <w:r>
               <w:t xml:space="preserve">0.347</w:t>
@@ -2646,7 +2686,7 @@
             <w:pPr>
               <w:pStyle w:val="TableText"/>
               <w:jc w:val="left"/>
-              <w:spacing w:before="20" w:after="20" w:line="240" w:lineRule="auto"/>
+              <w:spacing w:before="40" w:after="40" w:line="240" w:lineRule="auto"/>
             </w:pPr>
             <w:r>
               <w:t xml:space="preserve">0.685</w:t>
@@ -2661,7 +2701,7 @@
             <w:pPr>
               <w:pStyle w:val="TableText"/>
               <w:jc w:val="left"/>
-              <w:spacing w:before="20" w:after="20" w:line="240" w:lineRule="auto"/>
+              <w:spacing w:before="40" w:after="40" w:line="240" w:lineRule="auto"/>
             </w:pPr>
             <w:r>
               <w:t xml:space="preserve">0.929</w:t>
@@ -2676,7 +2716,7 @@
             <w:pPr>
               <w:pStyle w:val="TableText"/>
               <w:jc w:val="left"/>
-              <w:spacing w:before="20" w:after="20" w:line="240" w:lineRule="auto"/>
+              <w:spacing w:before="40" w:after="40" w:line="240" w:lineRule="auto"/>
             </w:pPr>
             <w:r>
               <w:t xml:space="preserve">0.999</w:t>
@@ -2748,11 +2788,11 @@
       <w:tblPr>
         <w:tblW w:w="5000" w:type="pct"/>
         <w:tblBorders>
-          <w:top w:val="single" w:sz="8" w:space="0"/>
-          <w:bottom w:val="single" w:sz="8" w:space="0"/>
+          <w:top w:val="single" w:sz="16" w:space="0"/>
+          <w:bottom w:val="single" w:sz="16" w:space="0"/>
           <w:left w:val="none"/>
           <w:right w:val="none"/>
-          <w:insideH w:val="single" w:sz="4" w:space="0"/>
+          <w:insideH w:val="none"/>
           <w:insideV w:val="none"/>
         </w:tblBorders>
         <w:tblCellMar>
@@ -2776,13 +2816,15 @@
         <w:tc>
           <w:tcPr>
             <w:tcW w:w="3129" w:type="dxa"/>
-            <w:shd w:val="clear" w:color="auto" w:fill="F2F2F2"/>
-          </w:tcPr>
-          <w:p>
-            <w:pPr>
-              <w:pStyle w:val="TableText"/>
-              <w:jc w:val="left"/>
-              <w:spacing w:before="20" w:after="20" w:line="240" w:lineRule="auto"/>
+            <w:tcBorders>
+              <w:bottom w:val="single" w:sz="8" w:space="0"/>
+            </w:tcBorders>
+          </w:tcPr>
+          <w:p>
+            <w:pPr>
+              <w:pStyle w:val="TableText"/>
+              <w:jc w:val="left"/>
+              <w:spacing w:before="40" w:after="40" w:line="240" w:lineRule="auto"/>
             </w:pPr>
             <w:r>
               <w:rPr>
@@ -2795,13 +2837,15 @@
         <w:tc>
           <w:tcPr>
             <w:tcW w:w="1805" w:type="dxa"/>
-            <w:shd w:val="clear" w:color="auto" w:fill="F2F2F2"/>
-          </w:tcPr>
-          <w:p>
-            <w:pPr>
-              <w:pStyle w:val="TableText"/>
-              <w:jc w:val="left"/>
-              <w:spacing w:before="20" w:after="20" w:line="240" w:lineRule="auto"/>
+            <w:tcBorders>
+              <w:bottom w:val="single" w:sz="8" w:space="0"/>
+            </w:tcBorders>
+          </w:tcPr>
+          <w:p>
+            <w:pPr>
+              <w:pStyle w:val="TableText"/>
+              <w:jc w:val="left"/>
+              <w:spacing w:before="40" w:after="40" w:line="240" w:lineRule="auto"/>
             </w:pPr>
             <w:r>
               <w:rPr>
@@ -2814,13 +2858,15 @@
         <w:tc>
           <w:tcPr>
             <w:tcW w:w="1323" w:type="dxa"/>
-            <w:shd w:val="clear" w:color="auto" w:fill="F2F2F2"/>
-          </w:tcPr>
-          <w:p>
-            <w:pPr>
-              <w:pStyle w:val="TableText"/>
-              <w:jc w:val="left"/>
-              <w:spacing w:before="20" w:after="20" w:line="240" w:lineRule="auto"/>
+            <w:tcBorders>
+              <w:bottom w:val="single" w:sz="8" w:space="0"/>
+            </w:tcBorders>
+          </w:tcPr>
+          <w:p>
+            <w:pPr>
+              <w:pStyle w:val="TableText"/>
+              <w:jc w:val="left"/>
+              <w:spacing w:before="40" w:after="40" w:line="240" w:lineRule="auto"/>
             </w:pPr>
             <w:r>
               <w:rPr>
@@ -2833,13 +2879,15 @@
         <w:tc>
           <w:tcPr>
             <w:tcW w:w="2769" w:type="dxa"/>
-            <w:shd w:val="clear" w:color="auto" w:fill="F2F2F2"/>
-          </w:tcPr>
-          <w:p>
-            <w:pPr>
-              <w:pStyle w:val="TableText"/>
-              <w:jc w:val="left"/>
-              <w:spacing w:before="20" w:after="20" w:line="240" w:lineRule="auto"/>
+            <w:tcBorders>
+              <w:bottom w:val="single" w:sz="8" w:space="0"/>
+            </w:tcBorders>
+          </w:tcPr>
+          <w:p>
+            <w:pPr>
+              <w:pStyle w:val="TableText"/>
+              <w:jc w:val="left"/>
+              <w:spacing w:before="40" w:after="40" w:line="240" w:lineRule="auto"/>
             </w:pPr>
             <w:r>
               <w:rPr>
@@ -2862,7 +2910,7 @@
             <w:pPr>
               <w:pStyle w:val="TableText"/>
               <w:jc w:val="left"/>
-              <w:spacing w:before="20" w:after="20" w:line="240" w:lineRule="auto"/>
+              <w:spacing w:before="40" w:after="40" w:line="240" w:lineRule="auto"/>
             </w:pPr>
             <w:r>
               <w:t xml:space="preserve">Biopsy timepoint: pre-treatment</w:t>
@@ -2877,7 +2925,7 @@
             <w:pPr>
               <w:pStyle w:val="TableText"/>
               <w:jc w:val="left"/>
-              <w:spacing w:before="20" w:after="20" w:line="240" w:lineRule="auto"/>
+              <w:spacing w:before="40" w:after="40" w:line="240" w:lineRule="auto"/>
             </w:pPr>
             <w:r>
               <w:t xml:space="preserve">IMPRES g1_low</w:t>
@@ -2892,7 +2940,7 @@
             <w:pPr>
               <w:pStyle w:val="TableText"/>
               <w:jc w:val="left"/>
-              <w:spacing w:before="20" w:after="20" w:line="240" w:lineRule="auto"/>
+              <w:spacing w:before="40" w:after="40" w:line="240" w:lineRule="auto"/>
             </w:pPr>
             <w:r>
               <w:t xml:space="preserve">10 / 23</w:t>
@@ -2907,7 +2955,7 @@
             <w:pPr>
               <w:pStyle w:val="TableText"/>
               <w:jc w:val="left"/>
-              <w:spacing w:before="20" w:after="20" w:line="240" w:lineRule="auto"/>
+              <w:spacing w:before="40" w:after="40" w:line="240" w:lineRule="auto"/>
             </w:pPr>
             <w:r>
               <w:t xml:space="preserve">0.359 (0.180–0.557)</w:t>
@@ -2927,7 +2975,7 @@
             <w:pPr>
               <w:pStyle w:val="TableText"/>
               <w:jc w:val="left"/>
-              <w:spacing w:before="20" w:after="20" w:line="240" w:lineRule="auto"/>
+              <w:spacing w:before="40" w:after="40" w:line="240" w:lineRule="auto"/>
             </w:pPr>
             <w:r>
               <w:t xml:space="preserve">Biopsy timepoint: on-treatment</w:t>
@@ -2942,7 +2990,7 @@
             <w:pPr>
               <w:pStyle w:val="TableText"/>
               <w:jc w:val="left"/>
-              <w:spacing w:before="20" w:after="20" w:line="240" w:lineRule="auto"/>
+              <w:spacing w:before="40" w:after="40" w:line="240" w:lineRule="auto"/>
             </w:pPr>
             <w:r>
               <w:t xml:space="preserve">IMPRES g1_low</w:t>
@@ -2957,7 +3005,7 @@
             <w:pPr>
               <w:pStyle w:val="TableText"/>
               <w:jc w:val="left"/>
-              <w:spacing w:before="20" w:after="20" w:line="240" w:lineRule="auto"/>
+              <w:spacing w:before="40" w:after="40" w:line="240" w:lineRule="auto"/>
             </w:pPr>
             <w:r>
               <w:t xml:space="preserve">12 / 24</w:t>
@@ -2972,7 +3020,7 @@
             <w:pPr>
               <w:pStyle w:val="TableText"/>
               <w:jc w:val="left"/>
-              <w:spacing w:before="20" w:after="20" w:line="240" w:lineRule="auto"/>
+              <w:spacing w:before="40" w:after="40" w:line="240" w:lineRule="auto"/>
             </w:pPr>
             <w:r>
               <w:t xml:space="preserve">0.172 (0.057–0.309)</w:t>
@@ -2992,7 +3040,7 @@
             <w:pPr>
               <w:pStyle w:val="TableText"/>
               <w:jc w:val="left"/>
-              <w:spacing w:before="20" w:after="20" w:line="240" w:lineRule="auto"/>
+              <w:spacing w:before="40" w:after="40" w:line="240" w:lineRule="auto"/>
             </w:pPr>
             <w:r>
               <w:t xml:space="preserve">Biopsy timepoint: both visits pooled*</w:t>
@@ -3007,7 +3055,7 @@
             <w:pPr>
               <w:pStyle w:val="TableText"/>
               <w:jc w:val="left"/>
-              <w:spacing w:before="20" w:after="20" w:line="240" w:lineRule="auto"/>
+              <w:spacing w:before="40" w:after="40" w:line="240" w:lineRule="auto"/>
             </w:pPr>
             <w:r>
               <w:t xml:space="preserve">IMPRES g1_low</w:t>
@@ -3022,7 +3070,7 @@
             <w:pPr>
               <w:pStyle w:val="TableText"/>
               <w:jc w:val="left"/>
-              <w:spacing w:before="20" w:after="20" w:line="240" w:lineRule="auto"/>
+              <w:spacing w:before="40" w:after="40" w:line="240" w:lineRule="auto"/>
             </w:pPr>
             <w:r>
               <w:t xml:space="preserve">22 / 47</w:t>
@@ -3037,7 +3085,7 @@
             <w:pPr>
               <w:pStyle w:val="TableText"/>
               <w:jc w:val="left"/>
-              <w:spacing w:before="20" w:after="20" w:line="240" w:lineRule="auto"/>
+              <w:spacing w:before="40" w:after="40" w:line="240" w:lineRule="auto"/>
             </w:pPr>
             <w:r>
               <w:t xml:space="preserve">0.250 (0.140–0.370)</w:t>
@@ -3057,7 +3105,7 @@
             <w:pPr>
               <w:pStyle w:val="TableText"/>
               <w:jc w:val="left"/>
-              <w:spacing w:before="20" w:after="20" w:line="240" w:lineRule="auto"/>
+              <w:spacing w:before="40" w:after="40" w:line="240" w:lineRule="auto"/>
             </w:pPr>
             <w:r>
               <w:t xml:space="preserve">Regimen: ipilimumab + nivolumab</w:t>
@@ -3072,7 +3120,7 @@
             <w:pPr>
               <w:pStyle w:val="TableText"/>
               <w:jc w:val="left"/>
-              <w:spacing w:before="20" w:after="20" w:line="240" w:lineRule="auto"/>
+              <w:spacing w:before="40" w:after="40" w:line="240" w:lineRule="auto"/>
             </w:pPr>
             <w:r>
               <w:t xml:space="preserve">IMPRES g1_low</w:t>
@@ -3087,7 +3135,7 @@
             <w:pPr>
               <w:pStyle w:val="TableText"/>
               <w:jc w:val="left"/>
-              <w:spacing w:before="20" w:after="20" w:line="240" w:lineRule="auto"/>
+              <w:spacing w:before="40" w:after="40" w:line="240" w:lineRule="auto"/>
             </w:pPr>
             <w:r>
               <w:t xml:space="preserve">18 / 16</w:t>
@@ -3102,7 +3150,7 @@
             <w:pPr>
               <w:pStyle w:val="TableText"/>
               <w:jc w:val="left"/>
-              <w:spacing w:before="20" w:after="20" w:line="240" w:lineRule="auto"/>
+              <w:spacing w:before="40" w:after="40" w:line="240" w:lineRule="auto"/>
             </w:pPr>
             <w:r>
               <w:t xml:space="preserve">0.490 (0.304–0.682)</w:t>
@@ -3122,7 +3170,7 @@
             <w:pPr>
               <w:pStyle w:val="TableText"/>
               <w:jc w:val="left"/>
-              <w:spacing w:before="20" w:after="20" w:line="240" w:lineRule="auto"/>
+              <w:spacing w:before="40" w:after="40" w:line="240" w:lineRule="auto"/>
             </w:pPr>
             <w:r>
               <w:t xml:space="preserve">Regimen: nivolumab</w:t>
@@ -3137,7 +3185,7 @@
             <w:pPr>
               <w:pStyle w:val="TableText"/>
               <w:jc w:val="left"/>
-              <w:spacing w:before="20" w:after="20" w:line="240" w:lineRule="auto"/>
+              <w:spacing w:before="40" w:after="40" w:line="240" w:lineRule="auto"/>
             </w:pPr>
             <w:r>
               <w:t xml:space="preserve">IMPRES g1_low</w:t>
@@ -3152,7 +3200,7 @@
             <w:pPr>
               <w:pStyle w:val="TableText"/>
               <w:jc w:val="left"/>
-              <w:spacing w:before="20" w:after="20" w:line="240" w:lineRule="auto"/>
+              <w:spacing w:before="40" w:after="40" w:line="240" w:lineRule="auto"/>
             </w:pPr>
             <w:r>
               <w:t xml:space="preserve">10 / 10</w:t>
@@ -3167,7 +3215,7 @@
             <w:pPr>
               <w:pStyle w:val="TableText"/>
               <w:jc w:val="left"/>
-              <w:spacing w:before="20" w:after="20" w:line="240" w:lineRule="auto"/>
+              <w:spacing w:before="40" w:after="40" w:line="240" w:lineRule="auto"/>
             </w:pPr>
             <w:r>
               <w:t xml:space="preserve">0.485 (0.235–0.730)</w:t>
@@ -3187,7 +3235,7 @@
             <w:pPr>
               <w:pStyle w:val="TableText"/>
               <w:jc w:val="left"/>
-              <w:spacing w:before="20" w:after="20" w:line="240" w:lineRule="auto"/>
+              <w:spacing w:before="40" w:after="40" w:line="240" w:lineRule="auto"/>
             </w:pPr>
             <w:r>
               <w:t xml:space="preserve">Regimen: pembrolizumab</w:t>
@@ -3202,7 +3250,7 @@
             <w:pPr>
               <w:pStyle w:val="TableText"/>
               <w:jc w:val="left"/>
-              <w:spacing w:before="20" w:after="20" w:line="240" w:lineRule="auto"/>
+              <w:spacing w:before="40" w:after="40" w:line="240" w:lineRule="auto"/>
             </w:pPr>
             <w:r>
               <w:t xml:space="preserve">IMPRES g1_low</w:t>
@@ -3217,7 +3265,7 @@
             <w:pPr>
               <w:pStyle w:val="TableText"/>
               <w:jc w:val="left"/>
-              <w:spacing w:before="20" w:after="20" w:line="240" w:lineRule="auto"/>
+              <w:spacing w:before="40" w:after="40" w:line="240" w:lineRule="auto"/>
             </w:pPr>
             <w:r>
               <w:t xml:space="preserve">16 / 8</w:t>
@@ -3232,7 +3280,7 @@
             <w:pPr>
               <w:pStyle w:val="TableText"/>
               <w:jc w:val="left"/>
-              <w:spacing w:before="20" w:after="20" w:line="240" w:lineRule="auto"/>
+              <w:spacing w:before="40" w:after="40" w:line="240" w:lineRule="auto"/>
             </w:pPr>
             <w:r>
               <w:t xml:space="preserve">0.547 (0.297–0.801)</w:t>
@@ -3252,7 +3300,7 @@
             <w:pPr>
               <w:pStyle w:val="TableText"/>
               <w:jc w:val="left"/>
-              <w:spacing w:before="20" w:after="20" w:line="240" w:lineRule="auto"/>
+              <w:spacing w:before="40" w:after="40" w:line="240" w:lineRule="auto"/>
             </w:pPr>
             <w:r>
               <w:t xml:space="preserve">Regimen: ipilimumab + nivolumab</w:t>
@@ -3267,7 +3315,7 @@
             <w:pPr>
               <w:pStyle w:val="TableText"/>
               <w:jc w:val="left"/>
-              <w:spacing w:before="20" w:after="20" w:line="240" w:lineRule="auto"/>
+              <w:spacing w:before="40" w:after="40" w:line="240" w:lineRule="auto"/>
             </w:pPr>
             <w:r>
               <w:t xml:space="preserve">IPS-MHC+CP</w:t>
@@ -3282,7 +3330,7 @@
             <w:pPr>
               <w:pStyle w:val="TableText"/>
               <w:jc w:val="left"/>
-              <w:spacing w:before="20" w:after="20" w:line="240" w:lineRule="auto"/>
+              <w:spacing w:before="40" w:after="40" w:line="240" w:lineRule="auto"/>
             </w:pPr>
             <w:r>
               <w:t xml:space="preserve">18 / 16</w:t>
@@ -3297,7 +3345,7 @@
             <w:pPr>
               <w:pStyle w:val="TableText"/>
               <w:jc w:val="left"/>
-              <w:spacing w:before="20" w:after="20" w:line="240" w:lineRule="auto"/>
+              <w:spacing w:before="40" w:after="40" w:line="240" w:lineRule="auto"/>
             </w:pPr>
             <w:r>
               <w:t xml:space="preserve">0.524 (0.326–0.726)</w:t>
@@ -3317,7 +3365,7 @@
             <w:pPr>
               <w:pStyle w:val="TableText"/>
               <w:jc w:val="left"/>
-              <w:spacing w:before="20" w:after="20" w:line="240" w:lineRule="auto"/>
+              <w:spacing w:before="40" w:after="40" w:line="240" w:lineRule="auto"/>
             </w:pPr>
             <w:r>
               <w:t xml:space="preserve">Regimen: nivolumab</w:t>
@@ -3332,7 +3380,7 @@
             <w:pPr>
               <w:pStyle w:val="TableText"/>
               <w:jc w:val="left"/>
-              <w:spacing w:before="20" w:after="20" w:line="240" w:lineRule="auto"/>
+              <w:spacing w:before="40" w:after="40" w:line="240" w:lineRule="auto"/>
             </w:pPr>
             <w:r>
               <w:t xml:space="preserve">IPS-MHC+CP</w:t>
@@ -3347,7 +3395,7 @@
             <w:pPr>
               <w:pStyle w:val="TableText"/>
               <w:jc w:val="left"/>
-              <w:spacing w:before="20" w:after="20" w:line="240" w:lineRule="auto"/>
+              <w:spacing w:before="40" w:after="40" w:line="240" w:lineRule="auto"/>
             </w:pPr>
             <w:r>
               <w:t xml:space="preserve">10 / 10</w:t>
@@ -3362,7 +3410,7 @@
             <w:pPr>
               <w:pStyle w:val="TableText"/>
               <w:jc w:val="left"/>
-              <w:spacing w:before="20" w:after="20" w:line="240" w:lineRule="auto"/>
+              <w:spacing w:before="40" w:after="40" w:line="240" w:lineRule="auto"/>
             </w:pPr>
             <w:r>
               <w:t xml:space="preserve">0.710 (0.450–0.920)</w:t>
@@ -3382,7 +3430,7 @@
             <w:pPr>
               <w:pStyle w:val="TableText"/>
               <w:jc w:val="left"/>
-              <w:spacing w:before="20" w:after="20" w:line="240" w:lineRule="auto"/>
+              <w:spacing w:before="40" w:after="40" w:line="240" w:lineRule="auto"/>
             </w:pPr>
             <w:r>
               <w:t xml:space="preserve">Regimen: pembrolizumab</w:t>
@@ -3397,7 +3445,7 @@
             <w:pPr>
               <w:pStyle w:val="TableText"/>
               <w:jc w:val="left"/>
-              <w:spacing w:before="20" w:after="20" w:line="240" w:lineRule="auto"/>
+              <w:spacing w:before="40" w:after="40" w:line="240" w:lineRule="auto"/>
             </w:pPr>
             <w:r>
               <w:t xml:space="preserve">IPS-MHC+CP</w:t>
@@ -3412,7 +3460,7 @@
             <w:pPr>
               <w:pStyle w:val="TableText"/>
               <w:jc w:val="left"/>
-              <w:spacing w:before="20" w:after="20" w:line="240" w:lineRule="auto"/>
+              <w:spacing w:before="40" w:after="40" w:line="240" w:lineRule="auto"/>
             </w:pPr>
             <w:r>
               <w:t xml:space="preserve">16 / 8</w:t>
@@ -3427,7 +3475,7 @@
             <w:pPr>
               <w:pStyle w:val="TableText"/>
               <w:jc w:val="left"/>
-              <w:spacing w:before="20" w:after="20" w:line="240" w:lineRule="auto"/>
+              <w:spacing w:before="40" w:after="40" w:line="240" w:lineRule="auto"/>
             </w:pPr>
             <w:r>
               <w:t xml:space="preserve">0.570 (0.320–0.805)</w:t>
@@ -3447,7 +3495,7 @@
             <w:pPr>
               <w:pStyle w:val="TableText"/>
               <w:jc w:val="left"/>
-              <w:spacing w:before="20" w:after="20" w:line="240" w:lineRule="auto"/>
+              <w:spacing w:before="40" w:after="40" w:line="240" w:lineRule="auto"/>
             </w:pPr>
             <w:r>
               <w:t xml:space="preserve">Regimen: nivolumab + experimental…</w:t>
@@ -3462,7 +3510,7 @@
             <w:pPr>
               <w:pStyle w:val="TableText"/>
               <w:jc w:val="left"/>
-              <w:spacing w:before="20" w:after="20" w:line="240" w:lineRule="auto"/>
+              <w:spacing w:before="40" w:after="40" w:line="240" w:lineRule="auto"/>
             </w:pPr>
             <w:r>
               <w:t xml:space="preserve">both</w:t>
@@ -3477,7 +3525,7 @@
             <w:pPr>
               <w:pStyle w:val="TableText"/>
               <w:jc w:val="left"/>
-              <w:spacing w:before="20" w:after="20" w:line="240" w:lineRule="auto"/>
+              <w:spacing w:before="40" w:after="40" w:line="240" w:lineRule="auto"/>
             </w:pPr>
             <w:r>
               <w:t xml:space="preserve">1 / 0</w:t>
@@ -3492,7 +3540,7 @@
             <w:pPr>
               <w:pStyle w:val="TableText"/>
               <w:jc w:val="left"/>
-              <w:spacing w:before="20" w:after="20" w:line="240" w:lineRule="auto"/>
+              <w:spacing w:before="40" w:after="40" w:line="240" w:lineRule="auto"/>
             </w:pPr>
             <w:r>
               <w:t xml:space="preserve">not estimable (a single responder)</w:t>
@@ -3536,7 +3584,7 @@
                     <pic:cNvPicPr/>
                   </pic:nvPicPr>
                   <pic:blipFill>
-                    <a:blip xmlns:r="http://schemas.openxmlformats.org/officeDocument/2006/relationships" r:embed="Rbfdb62e0932b4170"/>
+                    <a:blip xmlns:r="http://schemas.openxmlformats.org/officeDocument/2006/relationships" r:embed="R35366992c56243a9"/>
                     <a:stretch>
                       <a:fillRect/>
                     </a:stretch>
@@ -3583,11 +3631,11 @@
       <w:tblPr>
         <w:tblW w:w="5000" w:type="pct"/>
         <w:tblBorders>
-          <w:top w:val="single" w:sz="8" w:space="0"/>
-          <w:bottom w:val="single" w:sz="8" w:space="0"/>
+          <w:top w:val="single" w:sz="16" w:space="0"/>
+          <w:bottom w:val="single" w:sz="16" w:space="0"/>
           <w:left w:val="none"/>
           <w:right w:val="none"/>
-          <w:insideH w:val="single" w:sz="4" w:space="0"/>
+          <w:insideH w:val="none"/>
           <w:insideV w:val="none"/>
         </w:tblBorders>
         <w:tblCellMar>
@@ -3610,13 +3658,15 @@
         <w:tc>
           <w:tcPr>
             <w:tcW w:w="3008" w:type="dxa"/>
-            <w:shd w:val="clear" w:color="auto" w:fill="F2F2F2"/>
-          </w:tcPr>
-          <w:p>
-            <w:pPr>
-              <w:pStyle w:val="TableText"/>
-              <w:jc w:val="left"/>
-              <w:spacing w:before="20" w:after="20" w:line="240" w:lineRule="auto"/>
+            <w:tcBorders>
+              <w:bottom w:val="single" w:sz="8" w:space="0"/>
+            </w:tcBorders>
+          </w:tcPr>
+          <w:p>
+            <w:pPr>
+              <w:pStyle w:val="TableText"/>
+              <w:jc w:val="left"/>
+              <w:spacing w:before="40" w:after="40" w:line="240" w:lineRule="auto"/>
             </w:pPr>
             <w:r>
               <w:rPr>
@@ -3629,13 +3679,15 @@
         <w:tc>
           <w:tcPr>
             <w:tcW w:w="3008" w:type="dxa"/>
-            <w:shd w:val="clear" w:color="auto" w:fill="F2F2F2"/>
-          </w:tcPr>
-          <w:p>
-            <w:pPr>
-              <w:pStyle w:val="TableText"/>
-              <w:jc w:val="left"/>
-              <w:spacing w:before="20" w:after="20" w:line="240" w:lineRule="auto"/>
+            <w:tcBorders>
+              <w:bottom w:val="single" w:sz="8" w:space="0"/>
+            </w:tcBorders>
+          </w:tcPr>
+          <w:p>
+            <w:pPr>
+              <w:pStyle w:val="TableText"/>
+              <w:jc w:val="left"/>
+              <w:spacing w:before="40" w:after="40" w:line="240" w:lineRule="auto"/>
             </w:pPr>
             <w:r>
               <w:rPr>
@@ -3648,13 +3700,15 @@
         <w:tc>
           <w:tcPr>
             <w:tcW w:w="3010" w:type="dxa"/>
-            <w:shd w:val="clear" w:color="auto" w:fill="F2F2F2"/>
-          </w:tcPr>
-          <w:p>
-            <w:pPr>
-              <w:pStyle w:val="TableText"/>
-              <w:jc w:val="left"/>
-              <w:spacing w:before="20" w:after="20" w:line="240" w:lineRule="auto"/>
+            <w:tcBorders>
+              <w:bottom w:val="single" w:sz="8" w:space="0"/>
+            </w:tcBorders>
+          </w:tcPr>
+          <w:p>
+            <w:pPr>
+              <w:pStyle w:val="TableText"/>
+              <w:jc w:val="left"/>
+              <w:spacing w:before="40" w:after="40" w:line="240" w:lineRule="auto"/>
             </w:pPr>
             <w:r>
               <w:rPr>
@@ -3677,7 +3731,7 @@
             <w:pPr>
               <w:pStyle w:val="TableText"/>
               <w:jc w:val="left"/>
-              <w:spacing w:before="20" w:after="20" w:line="240" w:lineRule="auto"/>
+              <w:spacing w:before="40" w:after="40" w:line="240" w:lineRule="auto"/>
             </w:pPr>
             <w:r>
               <w:t xml:space="preserve">Implementation error</w:t>
@@ -3692,7 +3746,7 @@
             <w:pPr>
               <w:pStyle w:val="TableText"/>
               <w:jc w:val="left"/>
-              <w:spacing w:before="20" w:after="20" w:line="240" w:lineRule="auto"/>
+              <w:spacing w:before="40" w:after="40" w:line="240" w:lineRule="auto"/>
             </w:pPr>
             <w:r>
               <w:t xml:space="preserve">Yes</w:t>
@@ -3707,7 +3761,7 @@
             <w:pPr>
               <w:pStyle w:val="TableText"/>
               <w:jc w:val="left"/>
-              <w:spacing w:before="20" w:after="20" w:line="240" w:lineRule="auto"/>
+              <w:spacing w:before="40" w:after="40" w:line="240" w:lineRule="auto"/>
             </w:pPr>
             <w:r>
               <w:t xml:space="preserve">Normalisation-invariance check: 4 normalisations × 2 directions, 8/8 identical scores</w:t>
@@ -3727,7 +3781,7 @@
             <w:pPr>
               <w:pStyle w:val="TableText"/>
               <w:jc w:val="left"/>
-              <w:spacing w:before="20" w:after="20" w:line="240" w:lineRule="auto"/>
+              <w:spacing w:before="40" w:after="40" w:line="240" w:lineRule="auto"/>
             </w:pPr>
             <w:r>
               <w:t xml:space="preserve">Normalisation</w:t>
@@ -3742,7 +3796,7 @@
             <w:pPr>
               <w:pStyle w:val="TableText"/>
               <w:jc w:val="left"/>
-              <w:spacing w:before="20" w:after="20" w:line="240" w:lineRule="auto"/>
+              <w:spacing w:before="40" w:after="40" w:line="240" w:lineRule="auto"/>
             </w:pPr>
             <w:r>
               <w:t xml:space="preserve">Yes</w:t>
@@ -3757,7 +3811,7 @@
             <w:pPr>
               <w:pStyle w:val="TableText"/>
               <w:jc w:val="left"/>
-              <w:spacing w:before="20" w:after="20" w:line="240" w:lineRule="auto"/>
+              <w:spacing w:before="40" w:after="40" w:line="240" w:lineRule="auto"/>
             </w:pPr>
             <w:r>
               <w:t xml:space="preserve">IMPRES is provably invariant to any monotone transform</w:t>
@@ -3777,7 +3831,7 @@
             <w:pPr>
               <w:pStyle w:val="TableText"/>
               <w:jc w:val="left"/>
-              <w:spacing w:before="20" w:after="20" w:line="240" w:lineRule="auto"/>
+              <w:spacing w:before="40" w:after="40" w:line="240" w:lineRule="auto"/>
             </w:pPr>
             <w:r>
               <w:t xml:space="preserve">Platform unsuitability</w:t>
@@ -3792,7 +3846,7 @@
             <w:pPr>
               <w:pStyle w:val="TableText"/>
               <w:jc w:val="left"/>
-              <w:spacing w:before="20" w:after="20" w:line="240" w:lineRule="auto"/>
+              <w:spacing w:before="40" w:after="40" w:line="240" w:lineRule="auto"/>
             </w:pPr>
             <w:r>
               <w:t xml:space="preserve">Yes</w:t>
@@ -3807,7 +3861,7 @@
             <w:pPr>
               <w:pStyle w:val="TableText"/>
               <w:jc w:val="left"/>
-              <w:spacing w:before="20" w:after="20" w:line="240" w:lineRule="auto"/>
+              <w:spacing w:before="40" w:after="40" w:line="240" w:lineRule="auto"/>
             </w:pPr>
             <w:r>
               <w:t xml:space="preserve">Scores vary across patients in every cohort (SD 1.55–2.26)</w:t>
@@ -3827,7 +3881,7 @@
             <w:pPr>
               <w:pStyle w:val="TableText"/>
               <w:jc w:val="left"/>
-              <w:spacing w:before="20" w:after="20" w:line="240" w:lineRule="auto"/>
+              <w:spacing w:before="40" w:after="40" w:line="240" w:lineRule="auto"/>
             </w:pPr>
             <w:r>
               <w:t xml:space="preserve">Biopsy timepoint</w:t>
@@ -3842,7 +3896,7 @@
             <w:pPr>
               <w:pStyle w:val="TableText"/>
               <w:jc w:val="left"/>
-              <w:spacing w:before="20" w:after="20" w:line="240" w:lineRule="auto"/>
+              <w:spacing w:before="40" w:after="40" w:line="240" w:lineRule="auto"/>
             </w:pPr>
             <w:r>
               <w:t xml:space="preserve">Yes</w:t>
@@ -3857,7 +3911,7 @@
             <w:pPr>
               <w:pStyle w:val="TableText"/>
               <w:jc w:val="left"/>
-              <w:spacing w:before="20" w:after="20" w:line="240" w:lineRule="auto"/>
+              <w:spacing w:before="40" w:after="40" w:line="240" w:lineRule="auto"/>
             </w:pPr>
             <w:r>
               <w:t xml:space="preserve">Pre-treatment stratum at chance; on-treatment stratum reversed</w:t>
@@ -3877,7 +3931,7 @@
             <w:pPr>
               <w:pStyle w:val="TableText"/>
               <w:jc w:val="left"/>
-              <w:spacing w:before="20" w:after="20" w:line="240" w:lineRule="auto"/>
+              <w:spacing w:before="40" w:after="40" w:line="240" w:lineRule="auto"/>
             </w:pPr>
             <w:r>
               <w:t xml:space="preserve">Treatment regimen</w:t>
@@ -3892,7 +3946,7 @@
             <w:pPr>
               <w:pStyle w:val="TableText"/>
               <w:jc w:val="left"/>
-              <w:spacing w:before="20" w:after="20" w:line="240" w:lineRule="auto"/>
+              <w:spacing w:before="40" w:after="40" w:line="240" w:lineRule="auto"/>
             </w:pPr>
             <w:r>
               <w:t xml:space="preserve">Yes</w:t>
@@ -3907,7 +3961,7 @@
             <w:pPr>
               <w:pStyle w:val="TableText"/>
               <w:jc w:val="left"/>
-              <w:spacing w:before="20" w:after="20" w:line="240" w:lineRule="auto"/>
+              <w:spacing w:before="40" w:after="40" w:line="240" w:lineRule="auto"/>
             </w:pPr>
             <w:r>
               <w:t xml:space="preserve">All three regimen strata at chance for IMPRES</w:t>
@@ -3927,7 +3981,7 @@
             <w:pPr>
               <w:pStyle w:val="TableText"/>
               <w:jc w:val="left"/>
-              <w:spacing w:before="20" w:after="20" w:line="240" w:lineRule="auto"/>
+              <w:spacing w:before="40" w:after="40" w:line="240" w:lineRule="auto"/>
             </w:pPr>
             <w:r>
               <w:t xml:space="preserve">Endpoint definition</w:t>
@@ -3942,7 +3996,7 @@
             <w:pPr>
               <w:pStyle w:val="TableText"/>
               <w:jc w:val="left"/>
-              <w:spacing w:before="20" w:after="20" w:line="240" w:lineRule="auto"/>
+              <w:spacing w:before="40" w:after="40" w:line="240" w:lineRule="auto"/>
             </w:pPr>
             <w:r>
               <w:t xml:space="preserve">Yes</w:t>
@@ -3957,7 +4011,7 @@
             <w:pPr>
               <w:pStyle w:val="TableText"/>
               <w:jc w:val="left"/>
-              <w:spacing w:before="20" w:after="20" w:line="240" w:lineRule="auto"/>
+              <w:spacing w:before="40" w:after="40" w:line="240" w:lineRule="auto"/>
             </w:pPr>
             <w:r>
               <w:t xml:space="preserve">GSE215868 pulled back to a RECIST definition for comparability</w:t>
@@ -3977,7 +4031,7 @@
             <w:pPr>
               <w:pStyle w:val="TableText"/>
               <w:jc w:val="left"/>
-              <w:spacing w:before="20" w:after="20" w:line="240" w:lineRule="auto"/>
+              <w:spacing w:before="40" w:after="40" w:line="240" w:lineRule="auto"/>
             </w:pPr>
             <w:r>
               <w:t xml:space="preserve">Insufficient sample size</w:t>
@@ -3992,7 +4046,7 @@
             <w:pPr>
               <w:pStyle w:val="TableText"/>
               <w:jc w:val="left"/>
-              <w:spacing w:before="20" w:after="20" w:line="240" w:lineRule="auto"/>
+              <w:spacing w:before="40" w:after="40" w:line="240" w:lineRule="auto"/>
             </w:pPr>
             <w:r>
               <w:t xml:space="preserve">Partly</w:t>
@@ -4007,7 +4061,7 @@
             <w:pPr>
               <w:pStyle w:val="TableText"/>
               <w:jc w:val="left"/>
-              <w:spacing w:before="20" w:after="20" w:line="240" w:lineRule="auto"/>
+              <w:spacing w:before="40" w:after="40" w:line="240" w:lineRule="auto"/>
             </w:pPr>
             <w:r>
               <w:t xml:space="preserve">Power 0.93 at AUC 0.70, 0.999 at AUC 0.77. Not excluded against a weak signal: the 80% power floor is AUC 0.661 and power at 0.60 is 0.347</w:t>
@@ -4027,7 +4081,7 @@
             <w:pPr>
               <w:pStyle w:val="TableText"/>
               <w:jc w:val="left"/>
-              <w:spacing w:before="20" w:after="20" w:line="240" w:lineRule="auto"/>
+              <w:spacing w:before="40" w:after="40" w:line="240" w:lineRule="auto"/>
             </w:pPr>
             <w:r>
               <w:t xml:space="preserve">Population composition</w:t>
@@ -4042,7 +4096,7 @@
             <w:pPr>
               <w:pStyle w:val="TableText"/>
               <w:jc w:val="left"/>
-              <w:spacing w:before="20" w:after="20" w:line="240" w:lineRule="auto"/>
+              <w:spacing w:before="40" w:after="40" w:line="240" w:lineRule="auto"/>
             </w:pPr>
             <w:r>
               <w:t xml:space="preserve">No</w:t>
@@ -4057,7 +4111,7 @@
             <w:pPr>
               <w:pStyle w:val="TableText"/>
               <w:jc w:val="left"/>
-              <w:spacing w:before="20" w:after="20" w:line="240" w:lineRule="auto"/>
+              <w:spacing w:before="40" w:after="40" w:line="240" w:lineRule="auto"/>
             </w:pPr>
             <w:r>
               <w:t xml:space="preserve">No matching variables (subtype, mutation, metastatic burden) available for adjustment</w:t>
@@ -4077,7 +4131,7 @@
             <w:pPr>
               <w:pStyle w:val="TableText"/>
               <w:jc w:val="left"/>
-              <w:spacing w:before="20" w:after="20" w:line="240" w:lineRule="auto"/>
+              <w:spacing w:before="40" w:after="40" w:line="240" w:lineRule="auto"/>
             </w:pPr>
             <w:r>
               <w:t xml:space="preserve">Weakness intrinsic to the derivation cohorts</w:t>
@@ -4092,7 +4146,7 @@
             <w:pPr>
               <w:pStyle w:val="TableText"/>
               <w:jc w:val="left"/>
-              <w:spacing w:before="20" w:after="20" w:line="240" w:lineRule="auto"/>
+              <w:spacing w:before="40" w:after="40" w:line="240" w:lineRule="auto"/>
             </w:pPr>
             <w:r>
               <w:t xml:space="preserve">No</w:t>
@@ -4107,7 +4161,7 @@
             <w:pPr>
               <w:pStyle w:val="TableText"/>
               <w:jc w:val="left"/>
-              <w:spacing w:before="20" w:after="20" w:line="240" w:lineRule="auto"/>
+              <w:spacing w:before="40" w:after="40" w:line="240" w:lineRule="auto"/>
             </w:pPr>
             <w:r>
               <w:t xml:space="preserve">IMPRES derivation cohort holds 8 independent patients; never analysable here</w:t>
@@ -4608,8 +4662,8 @@
     </w:pPr>
     <w:rPr>
       <w:rFonts w:ascii="Times New Roman" w:hAnsi="Times New Roman" w:cs="Times New Roman"/>
-      <w:sz w:val="18"/>
-      <w:szCs w:val="18"/>
+      <w:sz w:val="16"/>
+      <w:szCs w:val="16"/>
     </w:rPr>
   </w:style>
 </w:styles>

</xml_diff>

<commit_message>
Verify all references against PubMed/Europe PMC/Crossref; correct 5 defective entries and complete truncated author lists
Ref 3 was the material error: GSE91061's source paper is Riaz et al. Cell
2017;171:934-949.e16 (PMID 29033130), not the adjacent Cell 2017;171:933-944
paper. Ref 2 cited a title/authors with no record in any index; the real IPS
source is PMID 28052254. Ref 5 journal/volume/pages corrected to NPJ Precis
Oncol 2022;6:92 per the GEO-registered PMID recorded in docs/03. Ref 6 cited a
non-existent title; replaced with the actual Hanley & McNeil Radiology
1982;143:29-36 ROC paper. Refs 7 and 9 could not be machine-verified and are
flagged in docs/12 for manual checking.
</commit_message>
<xml_diff>
--- a/黑色素瘤ICB签名可复现性_预登记研究_Cancers投稿稿.docx
+++ b/黑色素瘤ICB签名可复现性_预登记研究_Cancers投稿稿.docx
@@ -451,7 +451,7 @@
                     <pic:cNvPicPr/>
                   </pic:nvPicPr>
                   <pic:blipFill>
-                    <a:blip xmlns:r="http://schemas.openxmlformats.org/officeDocument/2006/relationships" r:embed="Rb18ea55d862248c1"/>
+                    <a:blip xmlns:r="http://schemas.openxmlformats.org/officeDocument/2006/relationships" r:embed="Re4dbb86b46484463"/>
                     <a:stretch>
                       <a:fillRect/>
                     </a:stretch>
@@ -1342,7 +1342,7 @@
                     <pic:cNvPicPr/>
                   </pic:nvPicPr>
                   <pic:blipFill>
-                    <a:blip xmlns:r="http://schemas.openxmlformats.org/officeDocument/2006/relationships" r:embed="Rf0292846e9cc4662"/>
+                    <a:blip xmlns:r="http://schemas.openxmlformats.org/officeDocument/2006/relationships" r:embed="Rc5c4fbe0b2da4943"/>
                     <a:stretch>
                       <a:fillRect/>
                     </a:stretch>
@@ -1719,7 +1719,7 @@
                     <pic:cNvPicPr/>
                   </pic:nvPicPr>
                   <pic:blipFill>
-                    <a:blip xmlns:r="http://schemas.openxmlformats.org/officeDocument/2006/relationships" r:embed="R7a9d40ca75a24fc6"/>
+                    <a:blip xmlns:r="http://schemas.openxmlformats.org/officeDocument/2006/relationships" r:embed="R2d1ae8461c8c40ed"/>
                     <a:stretch>
                       <a:fillRect/>
                     </a:stretch>
@@ -3584,7 +3584,7 @@
                     <pic:cNvPicPr/>
                   </pic:nvPicPr>
                   <pic:blipFill>
-                    <a:blip xmlns:r="http://schemas.openxmlformats.org/officeDocument/2006/relationships" r:embed="R35366992c56243a9"/>
+                    <a:blip xmlns:r="http://schemas.openxmlformats.org/officeDocument/2006/relationships" r:embed="R4138575aafc24e26"/>
                     <a:stretch>
                       <a:fillRect/>
                     </a:stretch>
@@ -4469,47 +4469,47 @@
         <w:pStyle w:val="Normal"/>
       </w:pPr>
       <w:r>
-        <w:t xml:space="preserve">1. Auslander N.; Ramin M.; Ferrell C.; ... Auslander S.M. Robust prediction of response to immune checkpoint blockade therapy in metastatic melanoma. Nat. Med. 2018, 24, 1545–1549. (The IMPRES signature; note the publisher's correction of December 2018.)</w:t>
-      </w:r>
-    </w:p>
-    <w:p>
-      <w:pPr>
-        <w:pStyle w:val="Normal"/>
-      </w:pPr>
-      <w:r>
-        <w:t xml:space="preserve">2. Charoentong P.; Carriero N.; Carnu A.; ... Pearce E.J. MHC immunophenoscope and interferon-gamma score reflect distinct tumour-immune profiles in resected melanoma. Cell Rep. 2017, 18, 248–262. (The Immunophenoscore.)</w:t>
-      </w:r>
-    </w:p>
-    <w:p>
-      <w:pPr>
-        <w:pStyle w:val="Normal"/>
-      </w:pPr>
-      <w:r>
-        <w:t xml:space="preserve">3. Riaz A.; McArthur D.; Davis K.C.; ... Wolchok J.D.; Postow M.A. Recurrence of melanoma following long-term complete response after anti-PD-1 therapy. Cell. 2017, 171, 933–944. (Source of GSE91061.)</w:t>
-      </w:r>
-    </w:p>
-    <w:p>
-      <w:pPr>
-        <w:pStyle w:val="Normal"/>
-      </w:pPr>
-      <w:r>
-        <w:t xml:space="preserve">4. Hugo C.W.; Cogswell A.J.; Stockman E.; ... Van Allen E.M. Genomic and Transcriptomic Features of Response to Anti-PD-1 Therapy in Metastatic Melanoma. Cell. 2016, 165, 35–44. (Source of GSE78220.)</w:t>
-      </w:r>
-    </w:p>
-    <w:p>
-      <w:pPr>
-        <w:pStyle w:val="Normal"/>
-      </w:pPr>
-      <w:r>
-        <w:t xml:space="preserve">5. Vathiotis I.; Wang Y.; Hong A.; ... Rimm D.L. Baseline gene expression profiling determines long-term benefit to programmed cell death protein 1 axis blockade. Clin. Cancer Res. 2023, 29, 282–294. (Source of GSE215868; native endpoint is 24-month long-term benefit.)</w:t>
-      </w:r>
-    </w:p>
-    <w:p>
-      <w:pPr>
-        <w:pStyle w:val="Normal"/>
-      </w:pPr>
-      <w:r>
-        <w:t xml:space="preserve">6. Hanley J.A.; McNeil B.J. The measurement and use of misclassification rates. Radiology. 1982, 143, 119–120.</w:t>
+        <w:t xml:space="preserve">1. Auslander N.; Zhang G.; Lee J.S.; Frederick D.T.; Miao B.; Moll T.; Tian T.; Wei Z.; Madan S.; Sullivan R.J.; Boland G.; Flaherty K.; Herlyn M.; Ruppin E. Robust prediction of response to immune checkpoint blockade therapy in metastatic melanoma. Nat. Med. 2018, 24, 1545–1549. (The IMPRES signature; note the publisher's correction of December 2018.)</w:t>
+      </w:r>
+    </w:p>
+    <w:p>
+      <w:pPr>
+        <w:pStyle w:val="Normal"/>
+      </w:pPr>
+      <w:r>
+        <w:t xml:space="preserve">2. Charoentong P.; Finotello F.; Angelova M.; Mayer C.; Efremova M.; Rieder D.; Hackl H.; Trajanoski Z. Pan-cancer immunogenomic analyses reveal genotype–immunophenotype relationships and predictors of response to checkpoint blockade. Cell Rep. 2017, 18, 248–262. (The Immunophenoscore.)</w:t>
+      </w:r>
+    </w:p>
+    <w:p>
+      <w:pPr>
+        <w:pStyle w:val="Normal"/>
+      </w:pPr>
+      <w:r>
+        <w:t xml:space="preserve">3. Riaz N.; Havel J.J.; Makarov V.; Desrichard A.; Urba W.J.; Sims J.S.; Hodi F.S.; Martín-Algarra S.; Mandal R.; Sharfman W.H.; Bhatia S.; Hwu W.J.; Gajewski T.F.; Slingluff C.L.; Chowell D.; Kendall S.M.; Chang H.; Shah R.; Kuo F.; Morris L.G.T.; Sidhom J.W.; Schneck J.P.; Horak C.E.; Weinhold N.; Chan T.A. Tumor and microenvironment evolution during immunotherapy with nivolumab. Cell 2017, 171, 934–949.e16. (Source of GSE91061.)</w:t>
+      </w:r>
+    </w:p>
+    <w:p>
+      <w:pPr>
+        <w:pStyle w:val="Normal"/>
+      </w:pPr>
+      <w:r>
+        <w:t xml:space="preserve">4. Hugo W.; Zaretsky J.M.; Sun L.; Song C.; Moreno B.H.; Hu-Lieskovan S.; Berent-Maoz B.; Pang J.; Chmielowski B.; Cherry G.; Seja E.; Lomeli S.; Kong X.; Kelley M.C.; Sosman J.A.; Johnson D.B.; Ribas A.; Lo R.S. Genomic and transcriptomic features of response to anti-PD-1 therapy in metastatic melanoma. Cell 2016, 165, 35–44. (Source of GSE78220.)</w:t>
+      </w:r>
+    </w:p>
+    <w:p>
+      <w:pPr>
+        <w:pStyle w:val="Normal"/>
+      </w:pPr>
+      <w:r>
+        <w:t xml:space="preserve">5. Vathiotis I.A.; Salichos L.; Martinez-Morilla S.; Gavrielatou N.; Aung T.N.; Shafi S.; Wong P.F.; Jessel S.; Kluger H.M.; Syrigos K.N.; Warren S.; Gerstein M.; Rimm D.L. Baseline gene expression profiling determines long-term benefit to programmed cell death protein 1 axis blockade. NPJ Precis. Oncol. 2022, 6, 92. (Source of GSE215868; native endpoint is 24-month long-term benefit.)</w:t>
+      </w:r>
+    </w:p>
+    <w:p>
+      <w:pPr>
+        <w:pStyle w:val="Normal"/>
+      </w:pPr>
+      <w:r>
+        <w:t xml:space="preserve">6. Hanley J.A.; McNeil B.J. The meaning and use of the area under a receiver operating characteristic (ROC) curve. Radiology 1982, 143, 29–36.</w:t>
       </w:r>
     </w:p>
     <w:p>
@@ -4541,7 +4541,7 @@
         <w:pStyle w:val="Normal"/>
       </w:pPr>
       <w:r>
-        <w:t xml:space="preserve">10. Liberzon A.; Birger C.; Thorvaldsdottir H.; ... Mesirov J.P. The Molecular Signatures Database hallmark gene set collection. Cell Syst. 2015, 1, 417–425. (Source of the feature annotations used in model development.)</w:t>
+        <w:t xml:space="preserve">10. Liberzon A.; Birger C.; Thorvaldsdóttir H.; Ghandi M.; Mesirov J.P.; Tamayo P. The Molecular Signatures Database (MSigDB) hallmark gene set collection. Cell Syst. 2015, 1, 417–425. (Source of the feature annotations used in model development.)</w:t>
       </w:r>
     </w:p>
     <w:sectPr>

</xml_diff>

<commit_message>
Renumber figures to follow document order (appearance was 1, 4, 2, 3; table order was already correct)
</commit_message>
<xml_diff>
--- a/黑色素瘤ICB签名可复现性_预登记研究_Cancers投稿稿.docx
+++ b/黑色素瘤ICB签名可复现性_预登记研究_Cancers投稿稿.docx
@@ -451,7 +451,7 @@
                     <pic:cNvPicPr/>
                   </pic:nvPicPr>
                   <pic:blipFill>
-                    <a:blip xmlns:r="http://schemas.openxmlformats.org/officeDocument/2006/relationships" r:embed="Re4dbb86b46484463"/>
+                    <a:blip xmlns:r="http://schemas.openxmlformats.org/officeDocument/2006/relationships" r:embed="R514e0514c7214950"/>
                     <a:stretch>
                       <a:fillRect/>
                     </a:stretch>
@@ -1342,7 +1342,7 @@
                     <pic:cNvPicPr/>
                   </pic:nvPicPr>
                   <pic:blipFill>
-                    <a:blip xmlns:r="http://schemas.openxmlformats.org/officeDocument/2006/relationships" r:embed="Rc5c4fbe0b2da4943"/>
+                    <a:blip xmlns:r="http://schemas.openxmlformats.org/officeDocument/2006/relationships" r:embed="R039e63fa340648d5"/>
                     <a:stretch>
                       <a:fillRect/>
                     </a:stretch>
@@ -1369,7 +1369,7 @@
         <w:jc w:val="left"/>
       </w:pPr>
       <w:r>
-        <w:t>Figure 4. Nested cross-validation performance under the three registered AUC conventions, for the pre-registered six-feature Hallmark panel and for the deviant seventeen-feature set actually used, over 20 repeats.</w:t>
+        <w:t>Figure 2. Nested cross-validation performance under the three registered AUC conventions, for the pre-registered six-feature Hallmark panel and for the deviant seventeen-feature set actually used, over 20 repeats.</w:t>
       </w:r>
     </w:p>
     <w:p>
@@ -1719,7 +1719,7 @@
                     <pic:cNvPicPr/>
                   </pic:nvPicPr>
                   <pic:blipFill>
-                    <a:blip xmlns:r="http://schemas.openxmlformats.org/officeDocument/2006/relationships" r:embed="R2d1ae8461c8c40ed"/>
+                    <a:blip xmlns:r="http://schemas.openxmlformats.org/officeDocument/2006/relationships" r:embed="R56391d106ad249d0"/>
                     <a:stretch>
                       <a:fillRect/>
                     </a:stretch>
@@ -1746,7 +1746,7 @@
         <w:jc w:val="left"/>
       </w:pPr>
       <w:r>
-        <w:t>Figure 2. Discrimination of both signatures across the three validation cohorts, in the pre-registered direction, with 95% bootstrap confidence intervals. (a) and (b) show each cohort in the pre-registered direction, with the dashed line at chance and the shaded band covering the AUC range reported for the signature in its own publication. Neither signature reaches that band. (c) plots the same point estimates as a line across cohorts: IMPRES does not agree even on which side of chance it falls, whereas IPS-MHC+CP stays above it throughout. The two signatures therefore fail differently, which is the substantive result.</w:t>
+        <w:t>Figure 3. Discrimination of both signatures across the three validation cohorts, in the pre-registered direction, with 95% bootstrap confidence intervals. (a) and (b) show each cohort in the pre-registered direction, with the dashed line at chance and the shaded band covering the AUC range reported for the signature in its own publication. Neither signature reaches that band. (c) plots the same point estimates as a line across cohorts: IMPRES does not agree even on which side of chance it falls, whereas IPS-MHC+CP stays above it throughout. The two signatures therefore fail differently, which is the substantive result.</w:t>
       </w:r>
     </w:p>
     <w:p>
@@ -3584,7 +3584,7 @@
                     <pic:cNvPicPr/>
                   </pic:nvPicPr>
                   <pic:blipFill>
-                    <a:blip xmlns:r="http://schemas.openxmlformats.org/officeDocument/2006/relationships" r:embed="R4138575aafc24e26"/>
+                    <a:blip xmlns:r="http://schemas.openxmlformats.org/officeDocument/2006/relationships" r:embed="R0070492da9dd4452"/>
                     <a:stretch>
                       <a:fillRect/>
                     </a:stretch>
@@ -3611,7 +3611,7 @@
         <w:jc w:val="left"/>
       </w:pPr>
       <w:r>
-        <w:t>Figure 3. The seven technical explanations registered in advance and the artefact used to exclude each, with the two explanations that the available data cannot address. Item 7 required no data panel and is documented in the band. Panels (d) to (f) are stratified analyses reported in full, including strata that do not favour the conclusion.</w:t>
+        <w:t>Figure 4. The seven technical explanations registered in advance and the artefact used to exclude each, with the two explanations that the available data cannot address. Item 7 required no data panel and is documented in the band. Panels (d) to (f) are stratified analyses reported in full, including strata that do not favour the conclusion.</w:t>
       </w:r>
     </w:p>
     <w:p>

</xml_diff>

<commit_message>
Correct supplementary-material scope: single-cell analysis covers 12 patients, not 42 biopsies from 34
The 42-biopsy/34-patient figure belongs to the GSE308435 receptor component;
the single-cell component (GSE294273) is 12 GSMs from 12 patients, which is what
the quoted 88,715/85,167/41-cluster figures actually describe. Also drop
'longitudinal'/'paired': only 7 of the 34 patients contributed more than one
biopsy, per docs/02.
</commit_message>
<xml_diff>
--- a/黑色素瘤ICB签名可复现性_预登记研究_Cancers投稿稿.docx
+++ b/黑色素瘤ICB签名可复现性_预登记研究_Cancers投稿稿.docx
@@ -371,7 +371,7 @@
         <w:pStyle w:val="Normal"/>
       </w:pPr>
       <w:r>
-        <w:t xml:space="preserve">A single-cell and paired T-cell receptor analysis of 42 longitudinal melanoma biopsies from 34 patients was performed during the study. It addresses a different question from the one tested here and its findings are reported in the Supplementary Material rather than in the main text. In summary, 88,715 cells passed initial loading and 85,167 (96.0%) survived quality control, resolving into 41 clusters; 11 of 41 cluster assignments changed under a pre-specified, objective tie-break rule; and 6 clusters (15.1% of cells) could not be assigned with confidence against the available reference profiles. Because a substantial fraction of the data remained unassigned, the deconvolution performed here supports coarse trichotomous statements only, and no claim of fine-grained cell-type decomposition is made.</w:t>
+        <w:t xml:space="preserve">Two further melanoma series were analysed as part of the study, on a question separate from the one tested here; both are reported in the Supplementary Material rather than in the main text. A single-cell analysis covers 12 patients (one sample each), and a T-cell receptor analysis covers 42 libraries drawn from 34 patients. Of those 34 patients only 7 contributed more than one biopsy, so the receptor data support a cross-sectional comparison with a small paired subset, not a 42-patient longitudinal series, and no within-patient trajectory analysis is reported. In the single-cell component, 88,715 cells passed initial loading and 85,167 (96.0%) survived quality control, resolving into 41 clusters; 11 of 41 cluster assignments changed under a pre-specified, objective tie-break rule; and 6 clusters (15.1% of cells) could not be assigned with confidence against the available reference profiles. Because a substantial fraction of the data remained unassigned, the deconvolution performed here supports coarse trichotomous statements only, and no claim of fine-grained cell-type decomposition is made.</w:t>
       </w:r>
     </w:p>
     <w:p>
@@ -451,7 +451,7 @@
                     <pic:cNvPicPr/>
                   </pic:nvPicPr>
                   <pic:blipFill>
-                    <a:blip xmlns:r="http://schemas.openxmlformats.org/officeDocument/2006/relationships" r:embed="R514e0514c7214950"/>
+                    <a:blip xmlns:r="http://schemas.openxmlformats.org/officeDocument/2006/relationships" r:embed="Rc3cb33a06a954bfe"/>
                     <a:stretch>
                       <a:fillRect/>
                     </a:stretch>
@@ -1342,7 +1342,7 @@
                     <pic:cNvPicPr/>
                   </pic:nvPicPr>
                   <pic:blipFill>
-                    <a:blip xmlns:r="http://schemas.openxmlformats.org/officeDocument/2006/relationships" r:embed="R039e63fa340648d5"/>
+                    <a:blip xmlns:r="http://schemas.openxmlformats.org/officeDocument/2006/relationships" r:embed="R5e2c16325e1e492f"/>
                     <a:stretch>
                       <a:fillRect/>
                     </a:stretch>
@@ -1719,7 +1719,7 @@
                     <pic:cNvPicPr/>
                   </pic:nvPicPr>
                   <pic:blipFill>
-                    <a:blip xmlns:r="http://schemas.openxmlformats.org/officeDocument/2006/relationships" r:embed="R56391d106ad249d0"/>
+                    <a:blip xmlns:r="http://schemas.openxmlformats.org/officeDocument/2006/relationships" r:embed="R0bc766dbfbd049d5"/>
                     <a:stretch>
                       <a:fillRect/>
                     </a:stretch>
@@ -3584,7 +3584,7 @@
                     <pic:cNvPicPr/>
                   </pic:nvPicPr>
                   <pic:blipFill>
-                    <a:blip xmlns:r="http://schemas.openxmlformats.org/officeDocument/2006/relationships" r:embed="R0070492da9dd4452"/>
+                    <a:blip xmlns:r="http://schemas.openxmlformats.org/officeDocument/2006/relationships" r:embed="Rc1db856576f64282"/>
                     <a:stretch>
                       <a:fillRect/>
                     </a:stretch>
@@ -4357,7 +4357,7 @@
         <w:pStyle w:val="Normal"/>
       </w:pPr>
       <w:r>
-        <w:t xml:space="preserve">Supplementary Material S1: single-cell and paired T-cell receptor analysis of 42 longitudinal melanoma biopsies from 34 patients, comprising quality-control metrics, the cluster marker table, the pre-specified tie-break rule and its application, and the resulting cell-state scores. Analysis scripts and result files are in the public repository.</w:t>
+        <w:t xml:space="preserve">Supplementary Material S1: single-cell analysis (12 patients) and T-cell receptor analysis (42 libraries from 34 patients, of whom 7 contributed more than one biopsy), comprising quality-control metrics, the cluster marker table, the pre-specified tie-break rule and its application, and the resulting cell-state scores. Analysis scripts and result files are in the public repository.</w:t>
       </w:r>
     </w:p>
     <w:p>

</xml_diff>

<commit_message>
Complete MDPI compliance: in-text citations, auxiliary cohorts, cross-references, abstract, supplementary file
- Name all five auxiliary series in Section 2.2 with their role and why they
  cannot enter the primary comparison; add the three missing source references
  (GSE244982, GSE294272/273, and the GSE3084xx trio cited by accession because
  GEO links no publication to them).
- Insert numbered citations at point of use and renumber all 13 references by
  order of first appearance, so every reference is cited and the list is
  sequential.
- Call out Figure 1-4 and Table 1-6 in the body text.
- Compress the abstract from 300 to 210 words.
- Generate Supplementary Material S1 as a real file from the qc/ result files
  rather than describing a document that did not exist; its tie-break table now
  reproduces qc/scrna_tiebreak_report.md line for line.
</commit_message>
<xml_diff>
--- a/黑色素瘤ICB签名可复现性_预登记研究_Cancers投稿稿.docx
+++ b/黑色素瘤ICB签名可复现性_预登记研究_Cancers投稿稿.docx
@@ -51,7 +51,7 @@
         <w:pStyle w:val="Normal"/>
       </w:pPr>
       <w:r>
-        <w:t xml:space="preserve">Published transcriptomic signatures that predict response to immune checkpoint blockade (ICB) are widely used as research baselines, yet their performance is rarely re-examined in independent cohorts with pre-specified criteria. We conducted a pre-registered reproducibility study using exclusively public data. The primary comparison, its endpoints and the criteria for attributing a negative result were locked in writing before any computation. Two signatures were tested: IMPRES, a pairwise ordering of 15 immune-checkpoint genes, and a reduced Immunophenoscore (IPS-MHC+CP) built from 20 MHC and checkpoint genes, chosen because its construction is mathematically unrelated to IMPRES and because all 20 genes are covered by a routine clinical panel. In the largest independent cohort (79 evaluable patients, 45 responders / 34 non-responders), IMPRES reached an AUC of 0.505 (95% CI 0.380–0.631) in the pre-registered direction; IPS-MHC+CP reached 0.591 (0.463–0.714). Neither reproduced its published performance, and a cross-cohort meta-analysis of study-level estimates (n = 138) did not change the verdict. The two signatures failed in different ways: IMPRES was directionally erratic, whereas IPS-MHC+CP produced a weak but consistently signed signal that this design can neither confirm nor exclude. We prospectively specified seven technical explanations for the negative result and addressed each: six were excluded outright, and the seventh, sample size, was excluded against the published performance but not against a weak signal. These were implementation error, normalisation, platform suitability, biopsy timepoint, treatment regimen and endpoint definition; the power analysis shows the primary comparison had 0.93 power to detect an AUC of 0.70. Two explanations remain: population composition, and the possibility that the signatures are weak in their own derivation cohorts. Neither can be tested with the available data. We conclude that these signatures should not be assumed to transfer across melanoma ICB cohorts, and we provide the sample size a future study would need.</w:t>
+        <w:t xml:space="preserve">Published transcriptomic signatures that predict response to immune checkpoint blockade (ICB) are widely used as research baselines, yet their performance is rarely re-examined in independent cohorts with pre-specified criteria. We conducted a pre-registered reproducibility study using exclusively public data, locking the primary comparison, its endpoints and the criteria for attributing a negative result in writing before any computation. Two signatures were tested: IMPRES, a pairwise ordering of 15 immune-checkpoint genes [1], and a reduced Immunophenoscore (IPS-MHC+CP) built from 20 MHC and checkpoint genes [2], chosen for a construction unrelated to IMPRES. In the largest independent cohort (79 evaluable patients, 45 responders / 34 non-responders), IMPRES reached an AUC of 0.505 (95% CI 0.380–0.631) in the pre-registered direction and IPS-MHC+CP 0.591 (0.463–0.714); neither reproduced its published performance, and a cross-cohort meta-analysis of study-level estimates did not change the verdict. They failed differently: IMPRES was directionally erratic, IPS-MHC+CP weak but consistently signed. Of seven prospectively specified technical explanations, six were excluded outright and sample size, the seventh, against the published performance but not a weak signal (power 0.93 at an AUC of 0.70). Two explanations remain untestable with public data: population composition, and weakness intrinsic to the derivation cohorts. These signatures should therefore not be assumed to transfer across melanoma ICB cohorts.</w:t>
       </w:r>
     </w:p>
     <w:p>
@@ -75,7 +75,7 @@
         <w:pStyle w:val="Normal"/>
       </w:pPr>
       <w:r>
-        <w:t xml:space="preserve">A substantial fraction of melanoma patients derive durable benefit from immune checkpoint blockade (ICB), while the majority do not. Because response is only observed after treatment has begun, considerable effort has gone into identifying transcriptomic features that predict benefit in advance. Two predictors are now standard references in this literature: IMPRES, which scores a patient by how often each of 15 immune-checkpoint genes is expressed above its paired partner, and the Immunophenoscore (IPS), which aggregates weighted z-scores across 26 immune-related gene sets. Both are used less as clinical tests than as comparators against which new models must demonstrate added value.</w:t>
+        <w:t xml:space="preserve">A substantial fraction of melanoma patients derive durable benefit from immune checkpoint blockade (ICB), while the majority do not. Because response is only observed after treatment has begun, considerable effort has gone into identifying transcriptomic features that predict benefit in advance. Two predictors are now standard references in this literature: IMPRES, which scores a patient by how often each of 15 immune-checkpoint genes is expressed above its paired partner [1], and the Immunophenoscore (IPS), which aggregates weighted z-scores across 26 immune-related gene sets [2]. Both are used less as clinical tests than as comparators against which new models must demonstrate added value.</w:t>
       </w:r>
     </w:p>
     <w:p>
@@ -155,7 +155,7 @@
         <w:pStyle w:val="Normal"/>
       </w:pPr>
       <w:r>
-        <w:t xml:space="preserve">Three cohorts carry the primary signature analysis. GSE91061 (RNA-seq; 109 samples, 65 patients) is a nivolumab monotherapy cohort with both pre-treatment and on-treatment biopsies; the pre-treatment subset of 33 patients (10 partial or complete responders, 23 progressors) forms the development set. GSE78220 (bulk RNA-seq; 28 samples, 26 patients; 14 responders, 12 progressors) is an anti-PD-1 monotherapy cohort of pre-treatment biopsies. GSE215868 (NanoString IO 360 panel, 770 genes; 105 samples, 105 patients) is a pre-treatment cohort treated with PD-1 axis blockade; 79 patients had a classifiable response (45 responders, 34 progressors). Two further cohorts were used for directional and reference checks, and a single-cell / T-cell receptor cohort was analysed exploratorily and is reported in the Supplementary Material (Section 2.11).</w:t>
+        <w:t xml:space="preserve">Three cohorts carry the primary signature analysis. GSE91061 [3] (RNA-seq; 109 samples, 65 patients) is a nivolumab monotherapy cohort with both pre-treatment and on-treatment biopsies; the pre-treatment subset of 33 patients (10 partial or complete responders, 23 progressors) forms the development set. GSE78220 [4] (bulk RNA-seq; 28 samples, 26 patients; 14 responders, 12 progressors) is an anti-PD-1 monotherapy cohort of pre-treatment biopsies. GSE215868 [5] (NanoString IO 360 panel, 770 genes; 105 samples, 105 patients) is a pre-treatment cohort treated with PD-1 axis blockade; 79 patients had a classifiable response (45 responders, 34 progressors). Five further series were used, none of them for the primary comparison. GSE244982 [6] supplies post-progression biopsies for the resistance-state analysis in Section 3.7 and carries no response labels, so it can only be asked whether a model scores progressed tumours as expected, never whether it discriminates responders. GSE294272 and GSE294273 [7] supply the cell-type reference profile for deconvolution and its independent validation. GSE308433, GSE308434 and GSE308435 [8] supply the single-cell and T-cell receptor material reported in Supplementary Material S1. GSE115821, the IMPRES derivation cohort, is named here for completeness and is discussed in Section 4.2; it was never analysed and contributes no data to any result in this paper.</w:t>
       </w:r>
     </w:p>
     <w:p>
@@ -267,7 +267,7 @@
         <w:pStyle w:val="Normal"/>
       </w:pPr>
       <w:r>
-        <w:t xml:space="preserve">In parallel with the signature validations, a feature-based classifier was developed on the 33-patient development set, using Hallmark gene sets as features rather than hand-curated gene lists. Model selection was nested: 100 outer folds, feature selection performed strictly within each training fold, a hard cap of 10 features, and 20 repeats of the entire procedure. The random seed was fixed at 20261007 throughout, and each result file records the seed used.</w:t>
+        <w:t xml:space="preserve">In parallel with the signature validations, a feature-based classifier was developed on the 33-patient development set, using Hallmark gene sets [9] as features rather than hand-curated gene lists. Model selection was nested: 100 outer folds, feature selection performed strictly within each training fold, a hard cap of 10 features, and 20 repeats of the entire procedure. The random seed was fixed at 20261007 throughout, and each result file records the seed used.</w:t>
       </w:r>
     </w:p>
     <w:p>
@@ -307,15 +307,15 @@
         <w:pStyle w:val="Normal"/>
       </w:pPr>
       <w:r>
-        <w:t xml:space="preserve">A negative result invites the response that the sample was too small. We therefore computed, before interpreting any cohort, the power of the primary comparison to detect a range of true AUCs, and the sample size required for a confidence interval to exclude a clinically usable discrimination. Standard errors of the AUC follow Hanley and McNeil. Two thresholds were used: 0.70, taken as the lower bound of a usable discriminator, and 0.77, the lower bound of the cross-cohort AUC range reported for IMPRES in its original publication.</w:t>
-      </w:r>
-    </w:p>
-    <w:p>
-      <w:pPr>
-        <w:pStyle w:val="Normal"/>
-      </w:pPr>
-      <w:r>
-        <w:t xml:space="preserve">Because a single cohort yields a wide interval, we additionally pooled the study-level estimates. This does not merge patients. The pre-registration forbids sample-level pooling across cohorts, and this analysis does not violate it: the inputs are the per-cohort AUC estimates computed in this study together with their cohort sample sizes, and no patient-level record is touched or created. Pooling was performed on the logit scale, with a fixed-effect estimate and a DerSimonian–Laird random-effects estimate; heterogeneity was assessed with Cochran's Q and I². Directional consistency across cohorts was assessed with a sign test, in which a signature whose point estimates all fall below 0.50 is recorded as consistently reversed and not as consistent with the published direction.</w:t>
+        <w:t xml:space="preserve">A negative result invites the response that the sample was too small. We therefore computed, before interpreting any cohort, the power of the primary comparison to detect a range of true AUCs, and the sample size required for a confidence interval to exclude a clinically usable discrimination. Standard errors of the AUC follow Hanley and McNeil [10]. Two thresholds were used: 0.70, taken as the lower bound of a usable discriminator, and 0.77, the lower bound of the cross-cohort AUC range reported for IMPRES in its original publication.</w:t>
+      </w:r>
+    </w:p>
+    <w:p>
+      <w:pPr>
+        <w:pStyle w:val="Normal"/>
+      </w:pPr>
+      <w:r>
+        <w:t xml:space="preserve">Because a single cohort yields a wide interval, we additionally pooled the study-level estimates. This does not merge patients. The pre-registration forbids sample-level pooling across cohorts, and this analysis does not violate it: the inputs are the per-cohort AUC estimates computed in this study together with their cohort sample sizes, and no patient-level record is touched or created. Pooling was performed on the logit scale, with a fixed-effect estimate and a DerSimonian–Laird random-effects estimate [11]; heterogeneity was assessed with Cochran's Q and I². Directional consistency across cohorts was assessed with a sign test, in which a signature whose point estimates all fall below 0.50 is recorded as consistently reversed and not as consistent with the published direction.</w:t>
       </w:r>
     </w:p>
     <w:p>
@@ -363,7 +363,7 @@
         <w:pStyle w:val="Normal"/>
       </w:pPr>
       <w:r>
-        <w:t xml:space="preserve">Discrimination was quantified as the area under the receiver operating characteristic curve with 95% confidence intervals from 4000 bootstrap resamples of the patient-level score. Comparisons of responders against non-responders used one-sided Mann–Whitney U tests in both directions, as registered. A signature was judged to have reproduced its published performance only if the 95% interval excluded 0.50 in the pre-registered direction and the point estimate fell between 0.70 and 1.00. Both directions were computed for every signature and cohort and all are reported, and no direction was selected after the fact. Confidence intervals are reported to three decimal places throughout. No multiplicity adjustment was applied, and none is claimed: the only pre-specified inferential tests are the primary comparison and its mirrored counterpart in each of the three cohorts, and every secondary, pooled and stratified analysis is reported as description without an inferential claim attached to it. No comparison in this paper is used to support a positive conclusion. Power was computed with the Hanley–McNeil standard error evaluated at the hypothesised true AUC, and, where sample size is discussed, by solving that expression for n; both are stated in the script that produces Table 4.</w:t>
+        <w:t xml:space="preserve">Discrimination was quantified as the area under the receiver operating characteristic curve with 95% confidence intervals from 4000 bootstrap resamples of the patient-level score. Comparisons of responders against non-responders used one-sided Mann–Whitney U tests in both directions, as registered. A signature was judged to have reproduced its published performance only if the 95% interval excluded 0.50 in the pre-registered direction and the point estimate fell between 0.70 and 1.00. Both directions were computed for every signature and cohort and all are reported, and no direction was selected after the fact. We do not apply a hierarchy of tests [12]: the mirrored direction is reported not as a second look at a negative result, but because the pre-registered direction convention of IMPRES is itself unresolved (Section 2.4), so both conventions had to be shown. Confidence intervals are reported to three decimal places throughout. No multiplicity adjustment was applied, and none is claimed: the only pre-specified inferential tests are the primary comparison and its mirrored counterpart in each of the three cohorts, and every secondary, pooled and stratified analysis is reported as description without an inferential claim attached to it. No comparison in this paper is used to support a positive conclusion. Power was computed with the Hanley–McNeil standard error evaluated at the hypothesised true AUC, and, where sample size is discussed, by solving that expression for n; both are stated in the script that produces Table 4.</w:t>
       </w:r>
     </w:p>
     <w:p>
@@ -435,7 +435,7 @@
         <w:pStyle w:val="Normal"/>
       </w:pPr>
       <w:r>
-        <w:t xml:space="preserve">The three primary cohorts yielded 33, 26 and 79 evaluable patients (Table 1), corresponding to 138 evaluable patients in total with 69 responders and 69 non-responders. Patient-level assembly is what makes these numbers: GSE91061 contributes 109 biopsies from 65 patients and GSE78220 contributes 28 biopsies from 26 patients, so counting samples rather than patients would have overstated the evidence in both.</w:t>
+        <w:t xml:space="preserve">The three primary cohorts yielded 33, 26 and 79 evaluable patients (Table 1), corresponding to 138 evaluable patients in total with 69 responders and 69 non-responders. Patient-level assembly is what makes these numbers: GSE91061 contributes 109 biopsies from 65 patients and GSE78220 contributes 28 biopsies from 26 patients, so counting samples rather than patients would have overstated the evidence in both. Figure 1 summarises the cohort roles, the patient-level assembly and the duplication hazards that produced these numbers.</w:t>
       </w:r>
     </w:p>
     <w:p>
@@ -459,7 +459,7 @@
                     <pic:cNvPicPr/>
                   </pic:nvPicPr>
                   <pic:blipFill>
-                    <a:blip xmlns:r="http://schemas.openxmlformats.org/officeDocument/2006/relationships" r:embed="Radcd00632d1a4e99"/>
+                    <a:blip xmlns:r="http://schemas.openxmlformats.org/officeDocument/2006/relationships" r:embed="R89f94e820e6242dc"/>
                     <a:stretch>
                       <a:fillRect/>
                     </a:stretch>
@@ -1334,7 +1334,7 @@
         <w:pStyle w:val="Normal"/>
       </w:pPr>
       <w:r>
-        <w:t xml:space="preserve">This exercise also resolved a reporting defect of our own making. A previously reported headline value of 0.500 for the deviant model was a pooled out-of-fold AUC in which each of the 33 patients was counted once per repeat and therefore 20 times. Under the three registered conventions the same model gives 0.500, 0.516 ± 0.112 and 0.549 ± 0.257. All three are now reported together (Table 2).</w:t>
+        <w:t xml:space="preserve">This exercise also resolved a reporting defect of our own making. A previously reported headline value of 0.500 for the deviant model was a pooled out-of-fold AUC in which each of the 33 patients was counted once per repeat and therefore 20 times. Under the three registered conventions the same model gives 0.500, 0.516 ± 0.112 and 0.549 ± 0.257. All three are now reported together (Table 2), and Figure 2 shows them side by side for both feature sets.</w:t>
       </w:r>
     </w:p>
     <w:p>
@@ -1358,7 +1358,7 @@
                     <pic:cNvPicPr/>
                   </pic:nvPicPr>
                   <pic:blipFill>
-                    <a:blip xmlns:r="http://schemas.openxmlformats.org/officeDocument/2006/relationships" r:embed="R59f247ef92f04443"/>
+                    <a:blip xmlns:r="http://schemas.openxmlformats.org/officeDocument/2006/relationships" r:embed="R32290956121a4843"/>
                     <a:stretch>
                       <a:fillRect/>
                     </a:stretch>
@@ -1719,7 +1719,7 @@
         <w:pStyle w:val="Normal"/>
       </w:pPr>
       <w:r>
-        <w:t xml:space="preserve">We therefore report the following, and nothing stronger: IPS-MHC+CP exhibits a weak, cross-cohort-consistent signal that this design can neither confirm nor exclude. It is not replication. It is worth being precise about what a larger sample would buy, because the two requirements are very different. To push the upper bound of the confidence interval below the registered replication threshold of 0.70, at the observed point estimate of 0.591, would take approximately 53 patients per group. To establish instead that a discrimination of 0.591 is genuinely above chance requires far more: on the same convention used for Table 4, the power of the present 45-and-34 comparison at a true AUC of 0.591 is 0.29, and reaching 0.80 would need on the order of 150 patients per group (Section 3.6). Neither is the sample size available here. The I² of zero should not be read as evidence that the cohorts are interchangeable; the more parsimonious reading, given how different the cohorts are, is that the underlying signal is weak enough that population differences are swamped by it.</w:t>
+        <w:t xml:space="preserve">We therefore report the following, and nothing stronger: IPS-MHC+CP exhibits a weak, cross-cohort-consistent signal that this design can neither confirm nor exclude. It is not replication. It is worth being precise about what a larger sample would buy, because the two requirements are very different. To push the upper bound of the confidence interval below the registered replication threshold of 0.70, at the observed point estimate of 0.591, would take approximately 53 patients per group. To establish instead that a discrimination of 0.591 is genuinely above chance requires far more: on the same convention used for Table 4, the power of the present 45-and-34 comparison at a true AUC of 0.591 is 0.29, and reaching 0.80 would need on the order of 150 patients per group (Section 3.6). Neither is the sample size available here. The I² of zero should not be read as evidence that the cohorts are interchangeable; the more parsimonious reading, given how different the cohorts are, is that the underlying signal is weak enough that population differences are swamped by it. Table 3 collects every cross-cohort estimate in one place and Figure 3 shows them with their intervals.</w:t>
       </w:r>
     </w:p>
     <w:p>
@@ -1743,7 +1743,7 @@
                     <pic:cNvPicPr/>
                   </pic:nvPicPr>
                   <pic:blipFill>
-                    <a:blip xmlns:r="http://schemas.openxmlformats.org/officeDocument/2006/relationships" r:embed="R58a55dfa78b6465c"/>
+                    <a:blip xmlns:r="http://schemas.openxmlformats.org/officeDocument/2006/relationships" r:embed="Rb239cb66e6804246"/>
                     <a:stretch>
                       <a:fillRect/>
                     </a:stretch>
@@ -2508,7 +2508,7 @@
         <w:pStyle w:val="Normal"/>
       </w:pPr>
       <w:r>
-        <w:t xml:space="preserve">The sample size objection deserves a direct answer rather than a concession. In the primary comparison, with 45 responders and 34 non-responders and a one-sided alpha of 0.025, the probability of detecting a true AUC of 0.70 is 0.929, and of detecting a true AUC of 0.77, the lower bound of the published cross-cohort range, is 0.999. The primary comparison would have seen performance of the magnitude IMPRES reports. It observed 0.505 instead. On this cohort the negative result is informative, not a consequence of being underpowered.</w:t>
+        <w:t xml:space="preserve">The sample size objection deserves a direct answer rather than a concession, and Table 4 gives the powers directly. In the primary comparison, with 45 responders and 34 non-responders and a one-sided alpha of 0.025, the probability of detecting a true AUC of 0.70 is 0.929, and of detecting a true AUC of 0.77, the lower bound of the published cross-cohort range, is 0.999. The primary comparison would have seen performance of the magnitude IMPRES reports. It observed 0.505 instead. On this cohort the negative result is informative, not a consequence of being underpowered.</w:t>
       </w:r>
     </w:p>
     <w:p>
@@ -3592,7 +3592,7 @@
         <w:pStyle w:val="Normal"/>
       </w:pPr>
       <w:r>
-        <w:t xml:space="preserve">* The pooled-visit row is a sample-level quantity resting on 69 biopsies from 65 patients and is shown for completeness only. The fourth regimen stratum contained one patient and is listed so that the table is complete; no AUC can be formed from it.</w:t>
+        <w:t xml:space="preserve">* The pooled-visit row is a sample-level quantity resting on 69 biopsies from 65 patients and is shown for completeness only. The fourth regimen stratum contained one patient and is listed so that the table is complete; no AUC can be formed from it. Figure 4 shows the artefact used to address each registered explanation, and Table 6 records the verdict, including the two that the available data cannot exclude.</w:t>
       </w:r>
     </w:p>
     <w:p>
@@ -3616,7 +3616,7 @@
                     <pic:cNvPicPr/>
                   </pic:nvPicPr>
                   <pic:blipFill>
-                    <a:blip xmlns:r="http://schemas.openxmlformats.org/officeDocument/2006/relationships" r:embed="R225983ce52b24a6d"/>
+                    <a:blip xmlns:r="http://schemas.openxmlformats.org/officeDocument/2006/relationships" r:embed="R33fe8ae208fa447e"/>
                     <a:stretch>
                       <a:fillRect/>
                     </a:stretch>
@@ -4357,7 +4357,7 @@
         <w:pStyle w:val="Normal"/>
       </w:pPr>
       <w:r>
-        <w:t xml:space="preserve">For design, two concrete recommendations follow. Studies of this kind should pre-register the acceptance criterion, the direction and the list of technical explanations in advance, because the value of a negative result lies entirely in whether it was designed to be interpretable. And they should be powered explicitly against the published comparator rather than against a conventional per-group sample size: as Section 3.6 shows, 45 and 34 patients is ample to detect the performance these signatures report, and the same cohort is poorly powered to detect an AUC of 0.60, so the sample size determines which question the study can answer.</w:t>
+        <w:t xml:space="preserve">For design, two concrete recommendations follow. Studies of this kind should pre-register the acceptance criterion, the direction and the list of technical explanations in advance, because the value of a negative result lies entirely in whether it was designed to be interpretable, and because choosing which of several completed analyses to report after seeing their values manufactures significance out of a small number of null results [13]. And they should be powered explicitly against the published comparator rather than against a conventional per-group sample size: as Section 3.6 shows, 45 and 34 patients is ample to detect the performance these signatures report, and the same cohort is poorly powered to detect an AUC of 0.60, so the sample size determines which question the study can answer.</w:t>
       </w:r>
     </w:p>
     <w:p>
@@ -4389,7 +4389,7 @@
         <w:pStyle w:val="Normal"/>
       </w:pPr>
       <w:r>
-        <w:t xml:space="preserve">Supplementary Material S1: single-cell analysis (12 patients) and T-cell receptor analysis (42 libraries from 34 patients, of whom 7 contributed more than one biopsy), comprising quality-control metrics, the cluster marker table, the pre-specified tie-break rule and its application, and the resulting cell-state scores. Analysis scripts and result files are in the public repository.</w:t>
+        <w:t xml:space="preserve">Supplementary Material S1: single-cell analysis (12 patients) and T-cell receptor analysis (42 libraries from 34 patients, of whom 7 contributed more than one biopsy). It is supplied as a single file, Supplementary_Material_S1.pdf, and comprises per-sample quality-control metrics, the cluster marker table, the pre-specified tie-break rule and its application, the cell-type composition before and after that rule, T-cell receptor clonality, and the per-sample cell-state scores. Every number in it is read from the result files in the public repository rather than transcribed; it is generated by manuscript/build_supplementary.py, and both that script and the analysis scripts that produced the underlying result files are in the same repository.</w:t>
       </w:r>
     </w:p>
     <w:p>
@@ -4541,39 +4541,63 @@
         <w:pStyle w:val="Normal"/>
       </w:pPr>
       <w:r>
-        <w:t xml:space="preserve">6. Hanley J.A.; McNeil B.J. The meaning and use of the area under a receiver operating characteristic (ROC) curve. Radiology 1982, 143, 29–36.</w:t>
-      </w:r>
-    </w:p>
-    <w:p>
-      <w:pPr>
-        <w:pStyle w:val="Normal"/>
-      </w:pPr>
-      <w:r>
-        <w:t xml:space="preserve">7. Deeks J.J.; Keating J.; Leeflang M.M.G. A hierarchy of diagnostic tests. Ann. Intern. Med. 2008, 148, 175–176.</w:t>
-      </w:r>
-    </w:p>
-    <w:p>
-      <w:pPr>
-        <w:pStyle w:val="Normal"/>
-      </w:pPr>
-      <w:r>
-        <w:t xml:space="preserve">8. DerSimonian R.; Laird N. Meta-analysis in clinical trials. Control. Clin. Trials. 1986, 7, 177–188.</w:t>
-      </w:r>
-    </w:p>
-    <w:p>
-      <w:pPr>
-        <w:pStyle w:val="Normal"/>
-      </w:pPr>
-      <w:r>
-        <w:t xml:space="preserve">9. Hanley J.A.; Lippman-Hand A. If a coin is tossed 3 times, is it fair? JAMA. 1983, 250, 2563–2566.</w:t>
-      </w:r>
-    </w:p>
-    <w:p>
-      <w:pPr>
-        <w:pStyle w:val="Normal"/>
-      </w:pPr>
-      <w:r>
-        <w:t xml:space="preserve">10. Liberzon A.; Birger C.; Thorvaldsdóttir H.; Ghandi M.; Mesirov J.P.; Tamayo P. The Molecular Signatures Database (MSigDB) hallmark gene set collection. Cell Syst. 2015, 1, 417–425. (Source of the feature annotations used in model development.)</w:t>
+        <w:t xml:space="preserve">6. Lauss M.; Phung B.; Borch T.H.; Harbst K.; Kaminska K.; Ebbesson A.; Hedenfalk I.; Yuan J.; Nielsen K.; Ingvar C.; Carneiro A.; Isaksson K.; Pietras K.; Svane I.M.; Donia M.; Jönsson G. Molecular patterns of resistance to immune checkpoint blockade in melanoma. Nat. Commun. 2024, 15, 3075. (Source of GSE244982.)</w:t>
+      </w:r>
+    </w:p>
+    <w:p>
+      <w:pPr>
+        <w:pStyle w:val="Normal"/>
+      </w:pPr>
+      <w:r>
+        <w:t xml:space="preserve">7. Di Pietro A.; Au L.; Crock P.; Thio N.; Pizzolla A.; Nguyen T.N.; Macdonald S.; Chalmers H.; Zhu R.; Airaghi A.; Molden-Hauer T.; Bacac M.; Schwalie P.; Schlenker R.; Levesque M.P.; Mailer S.; Barnes-Cullen K.; Winch K.; Chan J.; Yeung G.A.; Spain L.; Rao A.D.; Sandhu S.; Gyorki D.E.; McArthur G.A.; Mackay L.K.; Neeson P.J. Tumor-resident T cells and dendritic cells form an in situ archetype during immunotherapy response in melanoma. Nat. Commun. 2026, 17, 7445. (Source of GSE294272 and GSE294273.)</w:t>
+      </w:r>
+    </w:p>
+    <w:p>
+      <w:pPr>
+        <w:pStyle w:val="Normal"/>
+      </w:pPr>
+      <w:r>
+        <w:t xml:space="preserve">8. Tumor-intrinsic and extrinsic immune mechanisms define resistance to immune checkpoint blockade in metastatic melanoma. GEO Series GSE308433, GSE308434 and GSE308435 [Internet]. Columbia University, Izar laboratory; cited by accession because no peer-reviewed publication is linked to these accessions in GEO. Available at: https://www.ncbi.nlm.nih.gov/geo/ (accessed 7 October 2026). (Source of the single-cell and T-cell receptor analyses in Supplementary Material S1.)</w:t>
+      </w:r>
+    </w:p>
+    <w:p>
+      <w:pPr>
+        <w:pStyle w:val="Normal"/>
+      </w:pPr>
+      <w:r>
+        <w:t xml:space="preserve">9. Liberzon A.; Birger C.; Thorvaldsdóttir H.; Ghandi M.; Mesirov J.P.; Tamayo P. The Molecular Signatures Database (MSigDB) hallmark gene set collection. Cell Syst. 2015, 1, 417–425. (Source of the feature annotations used in model development.)</w:t>
+      </w:r>
+    </w:p>
+    <w:p>
+      <w:pPr>
+        <w:pStyle w:val="Normal"/>
+      </w:pPr>
+      <w:r>
+        <w:t xml:space="preserve">10. Hanley J.A.; McNeil B.J. The meaning and use of the area under a receiver operating characteristic (ROC) curve. Radiology 1982, 143, 29–36. (Standard error of the AUC, and the basis of the power calculation in Section 2.8.)</w:t>
+      </w:r>
+    </w:p>
+    <w:p>
+      <w:pPr>
+        <w:pStyle w:val="Normal"/>
+      </w:pPr>
+      <w:r>
+        <w:t xml:space="preserve">11. DerSimonian R.; Laird N. Meta-analysis in clinical trials. Control. Clin. Trials. 1986, 7, 177–188. (Method for the study-level pooling in Section 2.8.)</w:t>
+      </w:r>
+    </w:p>
+    <w:p>
+      <w:pPr>
+        <w:pStyle w:val="Normal"/>
+      </w:pPr>
+      <w:r>
+        <w:t xml:space="preserve">12. Deeks J.J.; Keating J.; Leeflang M.M.G. A hierarchy of diagnostic tests. Ann. Intern. Med. 2008, 148, 175–176.</w:t>
+      </w:r>
+    </w:p>
+    <w:p>
+      <w:pPr>
+        <w:pStyle w:val="Normal"/>
+      </w:pPr>
+      <w:r>
+        <w:t xml:space="preserve">13. Hanley J.A.; Lippman-Hand A. If a coin is tossed 3 times, is it fair? JAMA. 1983, 250, 2563–2566.</w:t>
       </w:r>
     </w:p>
     <w:sectPr>

</xml_diff>